<commit_message>
docs: Refresh Week 3 report build
</commit_message>
<xml_diff>
--- a/report/report_week3.docx
+++ b/report/report_week3.docx
@@ -1,14 +1,13 @@
 
 <file path=word/document.xml><?xml version="1.0" encoding="utf-8"?>
-<w:document xmlns:w="http://schemas.openxmlformats.org/wordprocessingml/2006/main">
+<w:document xmlns:wpc="http://schemas.microsoft.com/office/word/2010/wordprocessingCanvas" xmlns:cx="http://schemas.microsoft.com/office/drawing/2014/chartex" xmlns:cx1="http://schemas.microsoft.com/office/drawing/2015/9/8/chartex" xmlns:cx2="http://schemas.microsoft.com/office/drawing/2015/10/21/chartex" xmlns:cx3="http://schemas.microsoft.com/office/drawing/2016/5/9/chartex" xmlns:cx4="http://schemas.microsoft.com/office/drawing/2016/5/10/chartex" xmlns:cx5="http://schemas.microsoft.com/office/drawing/2016/5/11/chartex" xmlns:cx6="http://schemas.microsoft.com/office/drawing/2016/5/12/chartex" xmlns:cx7="http://schemas.microsoft.com/office/drawing/2016/5/13/chartex" xmlns:cx8="http://schemas.microsoft.com/office/drawing/2016/5/14/chartex" xmlns:mc="http://schemas.openxmlformats.org/markup-compatibility/2006" xmlns:aink="http://schemas.microsoft.com/office/drawing/2016/ink" xmlns:am3d="http://schemas.microsoft.com/office/drawing/2017/model3d" xmlns:o="urn:schemas-microsoft-com:office:office" xmlns:oel="http://schemas.microsoft.com/office/2019/extlst" xmlns:r="http://schemas.openxmlformats.org/officeDocument/2006/relationships" xmlns:m="http://schemas.openxmlformats.org/officeDocument/2006/math" xmlns:v="urn:schemas-microsoft-com:vml" xmlns:wp14="http://schemas.microsoft.com/office/word/2010/wordprocessingDrawing" xmlns:wp="http://schemas.openxmlformats.org/drawingml/2006/wordprocessingDrawing" xmlns:w10="urn:schemas-microsoft-com:office:word" xmlns:w="http://schemas.openxmlformats.org/wordprocessingml/2006/main" xmlns:w14="http://schemas.microsoft.com/office/word/2010/wordml" xmlns:w15="http://schemas.microsoft.com/office/word/2012/wordml" xmlns:w16cex="http://schemas.microsoft.com/office/word/2018/wordml/cex" xmlns:w16cid="http://schemas.microsoft.com/office/word/2016/wordml/cid" xmlns:w16="http://schemas.microsoft.com/office/word/2018/wordml" xmlns:w16du="http://schemas.microsoft.com/office/word/2023/wordml/word16du" xmlns:w16sdtdh="http://schemas.microsoft.com/office/word/2020/wordml/sdtdatahash" xmlns:w16sdtfl="http://schemas.microsoft.com/office/word/2024/wordml/sdtformatlock" xmlns:w16se="http://schemas.microsoft.com/office/word/2015/wordml/symex" xmlns:wpg="http://schemas.microsoft.com/office/word/2010/wordprocessingGroup" xmlns:wpi="http://schemas.microsoft.com/office/word/2010/wordprocessingInk" xmlns:wne="http://schemas.microsoft.com/office/word/2006/wordml" xmlns:wps="http://schemas.microsoft.com/office/word/2010/wordprocessingShape" mc:Ignorable="w14 w15 w16se w16cid w16 w16cex w16sdtdh w16sdtfl w16du wp14">
   <w:body>
     <w:p>
       <w:pPr>
-        <w:spacing w:before="0" w:after="80"/>
-      </w:pPr>
-      <w:r>
-        <w:rPr>
-          <w:rFonts w:ascii="Calibri" w:hAnsi="Calibri"/>
+        <w:spacing w:after="80"/>
+      </w:pPr>
+      <w:r>
+        <w:rPr>
           <w:b/>
           <w:color w:val="1E40AF"/>
           <w:sz w:val="20"/>
@@ -18,11 +17,10 @@
     </w:p>
     <w:p>
       <w:pPr>
-        <w:spacing w:before="0" w:after="60"/>
-      </w:pPr>
-      <w:r>
-        <w:rPr>
-          <w:rFonts w:ascii="Calibri" w:hAnsi="Calibri"/>
+        <w:spacing w:after="60"/>
+      </w:pPr>
+      <w:r>
+        <w:rPr>
           <w:b/>
           <w:color w:val="0F172A"/>
           <w:sz w:val="48"/>
@@ -32,15 +30,30 @@
     </w:p>
     <w:p>
       <w:pPr>
-        <w:spacing w:before="0" w:after="240"/>
-      </w:pPr>
-      <w:r>
-        <w:rPr>
-          <w:rFonts w:ascii="Calibri" w:hAnsi="Calibri"/>
+        <w:spacing w:after="240"/>
+      </w:pPr>
+      <w:r>
+        <w:rPr>
           <w:color w:val="475569"/>
           <w:sz w:val="24"/>
         </w:rPr>
-        <w:t>Week 3 Technical Project Deliverable — TechPulse Insight Accessible Knowledge Portal</w:t>
+        <w:t xml:space="preserve">Week 3 Technical Project Deliverable — </w:t>
+      </w:r>
+      <w:proofErr w:type="spellStart"/>
+      <w:r>
+        <w:rPr>
+          <w:color w:val="475569"/>
+          <w:sz w:val="24"/>
+        </w:rPr>
+        <w:t>TechPulse</w:t>
+      </w:r>
+      <w:proofErr w:type="spellEnd"/>
+      <w:r>
+        <w:rPr>
+          <w:color w:val="475569"/>
+          <w:sz w:val="24"/>
+        </w:rPr>
+        <w:t xml:space="preserve"> Insight Accessible Knowledge Portal</w:t>
       </w:r>
     </w:p>
     <w:p>
@@ -50,43 +63,67 @@
         </w:pBdr>
         <w:spacing w:after="280"/>
       </w:pPr>
+      <w:proofErr w:type="spellStart"/>
+      <w:proofErr w:type="gramStart"/>
       <w:r>
         <w:rPr>
           <w:b/>
           <w:color w:val="1F2937"/>
           <w:sz w:val="20"/>
         </w:rPr>
-        <w:t>Candidate: </w:t>
+        <w:t>Candidate:</w:t>
       </w:r>
       <w:r>
         <w:rPr>
           <w:color w:val="4B5563"/>
           <w:sz w:val="20"/>
         </w:rPr>
-        <w:t xml:space="preserve">Ashish Ranjan Singh    |    </w:t>
-      </w:r>
+        <w:t>Ashish</w:t>
+      </w:r>
+      <w:proofErr w:type="spellEnd"/>
+      <w:proofErr w:type="gramEnd"/>
+      <w:r>
+        <w:rPr>
+          <w:color w:val="4B5563"/>
+          <w:sz w:val="20"/>
+        </w:rPr>
+        <w:t xml:space="preserve"> Ranjan Singh    |    </w:t>
+      </w:r>
+      <w:proofErr w:type="spellStart"/>
+      <w:proofErr w:type="gramStart"/>
       <w:r>
         <w:rPr>
           <w:b/>
           <w:color w:val="1F2937"/>
           <w:sz w:val="20"/>
         </w:rPr>
-        <w:t>Assignment: </w:t>
+        <w:t>Assignment:</w:t>
       </w:r>
       <w:r>
         <w:rPr>
           <w:color w:val="4B5563"/>
           <w:sz w:val="20"/>
         </w:rPr>
-        <w:t xml:space="preserve">Week 3    |    </w:t>
-      </w:r>
+        <w:t>Week</w:t>
+      </w:r>
+      <w:proofErr w:type="spellEnd"/>
+      <w:proofErr w:type="gramEnd"/>
+      <w:r>
+        <w:rPr>
+          <w:color w:val="4B5563"/>
+          <w:sz w:val="20"/>
+        </w:rPr>
+        <w:t xml:space="preserve"> 3    |    </w:t>
+      </w:r>
+      <w:proofErr w:type="spellStart"/>
+      <w:proofErr w:type="gramStart"/>
       <w:r>
         <w:rPr>
           <w:b/>
           <w:color w:val="1F2937"/>
           <w:sz w:val="20"/>
         </w:rPr>
-        <w:t>Status: </w:t>
+        <w:t>Status:</w:t>
       </w:r>
       <w:r>
         <w:rPr>
@@ -94,17 +131,25 @@
           <w:color w:val="059669"/>
           <w:sz w:val="20"/>
         </w:rPr>
-        <w:t>Completed &amp; Verified</w:t>
-      </w:r>
-    </w:p>
-    <w:p>
-      <w:pPr>
-        <w:pStyle w:val="Heading1"/>
+        <w:t>Completed</w:t>
+      </w:r>
+      <w:proofErr w:type="spellEnd"/>
+      <w:proofErr w:type="gramEnd"/>
+      <w:r>
+        <w:rPr>
+          <w:b/>
+          <w:color w:val="059669"/>
+          <w:sz w:val="20"/>
+        </w:rPr>
+        <w:t xml:space="preserve"> &amp; Verified</w:t>
+      </w:r>
+    </w:p>
+    <w:p>
+      <w:pPr>
         <w:spacing w:before="280" w:after="120"/>
       </w:pPr>
       <w:r>
         <w:rPr>
-          <w:rFonts w:ascii="Calibri" w:hAnsi="Calibri"/>
           <w:b/>
           <w:color w:val="1E3A8A"/>
           <w:sz w:val="32"/>
@@ -118,16 +163,29 @@
       </w:pPr>
       <w:r>
         <w:rPr>
-          <w:rFonts w:ascii="Calibri" w:hAnsi="Calibri"/>
           <w:color w:val="374151"/>
-          <w:sz w:val="22"/>
-        </w:rPr>
-        <w:t>This engineering report documents the architecture, implementation, and rigorous accessibility verification of the Week 3 project for the Junior Frontend Developer Internship at Yuva Intern (https://yuvaintern.com/my-internships). The objective of this milestone was to design and build an enterprise-grade accessible knowledge portal and technical article reader—named 'TechPulse Insight'—engineered to achieve full conformance with the Web Content Accessibility Guidelines (WCAG) 2.1 Level AA standards. The project demonstrates how sophisticated, aesthetically striking digital products can be engineered to be universally operable for users utilizing assistive technologies, keyboard-only input, or high-contrast visual ergonomics, all using pure Vanilla HTML5, modern CSS3, and ES6+ JavaScript.</w:t>
+        </w:rPr>
+        <w:t>This engineering report documents the architecture, implementation, and rigorous accessibility verification of the Week 3 project for the Junior Frontend Developer Internship at Yuva Intern (https://yuvaintern.com/my-internships). The objective of this milestone was to design and build an enterprise-grade accessible knowledge portal and technical article reader—named '</w:t>
+      </w:r>
+      <w:proofErr w:type="spellStart"/>
+      <w:r>
+        <w:rPr>
+          <w:color w:val="374151"/>
+        </w:rPr>
+        <w:t>TechPulse</w:t>
+      </w:r>
+      <w:proofErr w:type="spellEnd"/>
+      <w:r>
+        <w:rPr>
+          <w:color w:val="374151"/>
+        </w:rPr>
+        <w:t xml:space="preserve"> Insight'—engineered to achieve full conformance with the Web Content Accessibility Guidelines (WCAG) 2.1 Level AA standards. The project demonstrates how sophisticated, aesthetically striking digital products can be engineered to be universally operable for users utilizing assistive technologies, keyboard-only input, or high-contrast visual ergonomics, all using pure Vanilla HTML5, modern CSS3, and ES6+ JavaScript.</w:t>
       </w:r>
     </w:p>
     <w:tbl>
       <w:tblPr>
         <w:tblW w:w="9200" w:type="dxa"/>
+        <w:tblInd w:w="180" w:type="dxa"/>
         <w:tblBorders>
           <w:top w:val="single" w:sz="6" w:space="0" w:color="3B82F6"/>
           <w:left w:val="single" w:sz="24" w:space="0" w:color="2563EB"/>
@@ -140,7 +198,11 @@
           <w:bottom w:w="120" w:type="dxa"/>
           <w:right w:w="180" w:type="dxa"/>
         </w:tblCellMar>
+        <w:tblLook w:val="04A0" w:firstRow="1" w:lastRow="0" w:firstColumn="1" w:lastColumn="0" w:noHBand="0" w:noVBand="1"/>
       </w:tblPr>
+      <w:tblGrid>
+        <w:gridCol w:w="9200"/>
+      </w:tblGrid>
       <w:tr>
         <w:tc>
           <w:tcPr>
@@ -163,16 +225,61 @@
           <w:p>
             <w:pPr>
               <w:spacing w:after="40"/>
-            </w:pPr>
-            <w:r>
               <w:rPr>
                 <w:color w:val="1E3A8A"/>
                 <w:sz w:val="20"/>
               </w:rPr>
-              <w:t>Student Name: Ashish Ranjan Singh
-Internship Period: 5 Weeks (07-Jul-2026 to 11-Aug-2026)
-GitHub Repository: https://github.com/ASHISH-7142023/Yuva-Week3-Accessible-Portal
-Evaluation Status: Complete &amp; Verified (Week 3 of 5)</w:t>
+            </w:pPr>
+            <w:r>
+              <w:rPr>
+                <w:color w:val="1E3A8A"/>
+                <w:sz w:val="20"/>
+              </w:rPr>
+              <w:t xml:space="preserve">Student Name: Ashish Ranjan Singh Internship Period: 5 Weeks (07-Jul-2026 to 11-Aug-2026) </w:t>
+            </w:r>
+          </w:p>
+          <w:p>
+            <w:pPr>
+              <w:spacing w:after="40"/>
+              <w:rPr>
+                <w:color w:val="1E3A8A"/>
+                <w:sz w:val="20"/>
+              </w:rPr>
+            </w:pPr>
+            <w:r>
+              <w:rPr>
+                <w:color w:val="1E3A8A"/>
+                <w:sz w:val="20"/>
+              </w:rPr>
+              <w:t xml:space="preserve">GitHub Repository: </w:t>
+            </w:r>
+            <w:hyperlink r:id="rId4" w:history="1">
+              <w:r>
+                <w:rPr>
+                  <w:rStyle w:val="Hyperlink"/>
+                  <w:sz w:val="20"/>
+                </w:rPr>
+                <w:t>https://github.com/ASHISH-7142023/Yuva-Week3-Accessible-Portal</w:t>
+              </w:r>
+            </w:hyperlink>
+            <w:r>
+              <w:rPr>
+                <w:color w:val="1E3A8A"/>
+                <w:sz w:val="20"/>
+              </w:rPr>
+              <w:t xml:space="preserve"> </w:t>
+            </w:r>
+          </w:p>
+          <w:p>
+            <w:pPr>
+              <w:spacing w:after="40"/>
+            </w:pPr>
+            <w:r>
+              <w:rPr>
+                <w:color w:val="1E3A8A"/>
+                <w:sz w:val="20"/>
+              </w:rPr>
+              <w:t>Evaluation Status: Complete &amp; Verified (Week 3 of 5)</w:t>
             </w:r>
           </w:p>
         </w:tc>
@@ -185,12 +292,10 @@
     </w:p>
     <w:p>
       <w:pPr>
-        <w:pStyle w:val="Heading1"/>
         <w:spacing w:before="280" w:after="120"/>
       </w:pPr>
       <w:r>
         <w:rPr>
-          <w:rFonts w:ascii="Calibri" w:hAnsi="Calibri"/>
           <w:b/>
           <w:color w:val="1E3A8A"/>
           <w:sz w:val="32"/>
@@ -204,21 +309,31 @@
       </w:pPr>
       <w:r>
         <w:rPr>
-          <w:rFonts w:ascii="Calibri" w:hAnsi="Calibri"/>
           <w:color w:val="374151"/>
-          <w:sz w:val="22"/>
-        </w:rPr>
-        <w:t>Screen reader users frequently navigate web pages by cycling through structural landmark regions rather than reading sequential DOM nodes. TechPulse Insight implements a strict HTML5 landmark architecture ensuring zero ambiguity during assistive tree traversal.</w:t>
-      </w:r>
-    </w:p>
-    <w:p>
-      <w:pPr>
-        <w:pStyle w:val="Heading2"/>
+        </w:rPr>
+        <w:t xml:space="preserve">Screen reader users frequently navigate web pages by cycling through structural landmark regions rather than reading sequential DOM nodes. </w:t>
+      </w:r>
+      <w:proofErr w:type="spellStart"/>
+      <w:r>
+        <w:rPr>
+          <w:color w:val="374151"/>
+        </w:rPr>
+        <w:t>TechPulse</w:t>
+      </w:r>
+      <w:proofErr w:type="spellEnd"/>
+      <w:r>
+        <w:rPr>
+          <w:color w:val="374151"/>
+        </w:rPr>
+        <w:t xml:space="preserve"> Insight implements a strict HTML5 landmark architecture ensuring zero ambiguity during assistive tree traversal.</w:t>
+      </w:r>
+    </w:p>
+    <w:p>
+      <w:pPr>
         <w:spacing w:before="200" w:after="80"/>
       </w:pPr>
       <w:r>
         <w:rPr>
-          <w:rFonts w:ascii="Calibri" w:hAnsi="Calibri"/>
           <w:b/>
           <w:color w:val="2563EB"/>
           <w:sz w:val="26"/>
@@ -228,14 +343,13 @@
     </w:p>
     <w:p>
       <w:pPr>
-        <w:pStyle w:val="ListParagraph"/>
         <w:spacing w:after="80"/>
         <w:ind w:left="360"/>
       </w:pPr>
       <w:r>
         <w:rPr>
+          <w:b/>
           <w:color w:val="2563EB"/>
-          <w:b/>
         </w:rPr>
         <w:t xml:space="preserve">•  </w:t>
       </w:r>
@@ -243,29 +357,25 @@
         <w:rPr>
           <w:b/>
           <w:color w:val="1F2937"/>
-          <w:sz w:val="22"/>
         </w:rPr>
         <w:t xml:space="preserve">&lt;nav class='skip-links'&gt;: </w:t>
       </w:r>
       <w:r>
         <w:rPr>
-          <w:rFonts w:ascii="Calibri" w:hAnsi="Calibri"/>
           <w:color w:val="4B5563"/>
-          <w:sz w:val="22"/>
         </w:rPr>
         <w:t>Contains skip-navigation links allowing keyboard and screen reader users to bypass repetitive header elements.</w:t>
       </w:r>
     </w:p>
     <w:p>
       <w:pPr>
-        <w:pStyle w:val="ListParagraph"/>
         <w:spacing w:after="80"/>
         <w:ind w:left="360"/>
       </w:pPr>
       <w:r>
         <w:rPr>
+          <w:b/>
           <w:color w:val="2563EB"/>
-          <w:b/>
         </w:rPr>
         <w:t xml:space="preserve">•  </w:t>
       </w:r>
@@ -273,29 +383,39 @@
         <w:rPr>
           <w:b/>
           <w:color w:val="1F2937"/>
-          <w:sz w:val="22"/>
         </w:rPr>
         <w:t xml:space="preserve">&lt;aside class='a11y-toolbar'&gt;: </w:t>
       </w:r>
       <w:r>
         <w:rPr>
-          <w:rFonts w:ascii="Calibri" w:hAnsi="Calibri"/>
           <w:color w:val="4B5563"/>
-          <w:sz w:val="22"/>
-        </w:rPr>
-        <w:t>Houses the WAI-ARIA radiogroup theme contrast selector and fluid typography scaling controls.</w:t>
-      </w:r>
-    </w:p>
-    <w:p>
-      <w:pPr>
-        <w:pStyle w:val="ListParagraph"/>
+        </w:rPr>
+        <w:t xml:space="preserve">Houses the WAI-ARIA </w:t>
+      </w:r>
+      <w:proofErr w:type="spellStart"/>
+      <w:r>
+        <w:rPr>
+          <w:color w:val="4B5563"/>
+        </w:rPr>
+        <w:t>radiogroup</w:t>
+      </w:r>
+      <w:proofErr w:type="spellEnd"/>
+      <w:r>
+        <w:rPr>
+          <w:color w:val="4B5563"/>
+        </w:rPr>
+        <w:t xml:space="preserve"> theme contrast selector and fluid typography scaling controls.</w:t>
+      </w:r>
+    </w:p>
+    <w:p>
+      <w:pPr>
         <w:spacing w:after="80"/>
         <w:ind w:left="360"/>
       </w:pPr>
       <w:r>
         <w:rPr>
+          <w:b/>
           <w:color w:val="2563EB"/>
-          <w:b/>
         </w:rPr>
         <w:t xml:space="preserve">•  </w:t>
       </w:r>
@@ -303,59 +423,52 @@
         <w:rPr>
           <w:b/>
           <w:color w:val="1F2937"/>
-          <w:sz w:val="22"/>
         </w:rPr>
         <w:t xml:space="preserve">&lt;header class='site-header'&gt;: </w:t>
       </w:r>
       <w:r>
         <w:rPr>
-          <w:rFonts w:ascii="Calibri" w:hAnsi="Calibri"/>
           <w:color w:val="4B5563"/>
-          <w:sz w:val="22"/>
         </w:rPr>
         <w:t>Encloses the portal branding, primary menu, and ARIA reading progress tracker.</w:t>
       </w:r>
     </w:p>
     <w:p>
       <w:pPr>
-        <w:pStyle w:val="ListParagraph"/>
         <w:spacing w:after="80"/>
         <w:ind w:left="360"/>
       </w:pPr>
       <w:r>
         <w:rPr>
+          <w:b/>
           <w:color w:val="2563EB"/>
-          <w:b/>
-        </w:rPr>
+        </w:rPr>
+        <w:lastRenderedPageBreak/>
         <w:t xml:space="preserve">•  </w:t>
       </w:r>
       <w:r>
         <w:rPr>
           <w:b/>
           <w:color w:val="1F2937"/>
-          <w:sz w:val="22"/>
         </w:rPr>
         <w:t xml:space="preserve">&lt;main id='main-content'&gt;: </w:t>
       </w:r>
       <w:r>
         <w:rPr>
-          <w:rFonts w:ascii="Calibri" w:hAnsi="Calibri"/>
           <w:color w:val="4B5563"/>
-          <w:sz w:val="22"/>
         </w:rPr>
         <w:t>Serves as the primary programmatic focus target for skip links, containing all editorial and interactive sections.</w:t>
       </w:r>
     </w:p>
     <w:p>
       <w:pPr>
-        <w:pStyle w:val="ListParagraph"/>
         <w:spacing w:after="80"/>
         <w:ind w:left="360"/>
       </w:pPr>
       <w:r>
         <w:rPr>
+          <w:b/>
           <w:color w:val="2563EB"/>
-          <w:b/>
         </w:rPr>
         <w:t xml:space="preserve">•  </w:t>
       </w:r>
@@ -363,29 +476,25 @@
         <w:rPr>
           <w:b/>
           <w:color w:val="1F2937"/>
-          <w:sz w:val="22"/>
         </w:rPr>
         <w:t xml:space="preserve">&lt;article class='accessible-article'&gt;: </w:t>
       </w:r>
       <w:r>
         <w:rPr>
-          <w:rFonts w:ascii="Calibri" w:hAnsi="Calibri"/>
           <w:color w:val="4B5563"/>
-          <w:sz w:val="22"/>
         </w:rPr>
         <w:t>Encapsulates the featured technical research article, metadata headers, and accessible code figures.</w:t>
       </w:r>
     </w:p>
     <w:p>
       <w:pPr>
-        <w:pStyle w:val="ListParagraph"/>
         <w:spacing w:after="80"/>
         <w:ind w:left="360"/>
       </w:pPr>
       <w:r>
         <w:rPr>
+          <w:b/>
           <w:color w:val="2563EB"/>
-          <w:b/>
         </w:rPr>
         <w:t xml:space="preserve">•  </w:t>
       </w:r>
@@ -393,29 +502,25 @@
         <w:rPr>
           <w:b/>
           <w:color w:val="1F2937"/>
-          <w:sz w:val="22"/>
         </w:rPr>
         <w:t xml:space="preserve">&lt;aside class='portal-sidebar'&gt;: </w:t>
       </w:r>
       <w:r>
         <w:rPr>
-          <w:rFonts w:ascii="Calibri" w:hAnsi="Calibri"/>
           <w:color w:val="4B5563"/>
-          <w:sz w:val="22"/>
         </w:rPr>
         <w:t>Contains contextual author background and related research papers, clearly isolated from primary article flow.</w:t>
       </w:r>
     </w:p>
     <w:p>
       <w:pPr>
-        <w:pStyle w:val="ListParagraph"/>
         <w:spacing w:after="80"/>
         <w:ind w:left="360"/>
       </w:pPr>
       <w:r>
         <w:rPr>
+          <w:b/>
           <w:color w:val="2563EB"/>
-          <w:b/>
         </w:rPr>
         <w:t xml:space="preserve">•  </w:t>
       </w:r>
@@ -423,27 +528,22 @@
         <w:rPr>
           <w:b/>
           <w:color w:val="1F2937"/>
-          <w:sz w:val="22"/>
         </w:rPr>
         <w:t xml:space="preserve">&lt;footer class='site-footer'&gt;: </w:t>
       </w:r>
       <w:r>
         <w:rPr>
-          <w:rFonts w:ascii="Calibri" w:hAnsi="Calibri"/>
           <w:color w:val="4B5563"/>
-          <w:sz w:val="22"/>
         </w:rPr>
         <w:t>Provides copyright information, licensing notes, and project repository links.</w:t>
       </w:r>
     </w:p>
     <w:p>
       <w:pPr>
-        <w:pStyle w:val="Heading1"/>
         <w:spacing w:before="280" w:after="120"/>
       </w:pPr>
       <w:r>
         <w:rPr>
-          <w:rFonts w:ascii="Calibri" w:hAnsi="Calibri"/>
           <w:b/>
           <w:color w:val="1E3A8A"/>
           <w:sz w:val="32"/>
@@ -457,21 +557,17 @@
       </w:pPr>
       <w:r>
         <w:rPr>
-          <w:rFonts w:ascii="Calibri" w:hAnsi="Calibri"/>
           <w:color w:val="374151"/>
-          <w:sz w:val="22"/>
         </w:rPr>
         <w:t>Accessibility compliance was implemented according to the four foundational principles established by the W3C:</w:t>
       </w:r>
     </w:p>
     <w:p>
       <w:pPr>
-        <w:pStyle w:val="Heading2"/>
         <w:spacing w:before="200" w:after="80"/>
       </w:pPr>
       <w:r>
         <w:rPr>
-          <w:rFonts w:ascii="Calibri" w:hAnsi="Calibri"/>
           <w:b/>
           <w:color w:val="2563EB"/>
           <w:sz w:val="26"/>
@@ -485,21 +581,31 @@
       </w:pPr>
       <w:r>
         <w:rPr>
-          <w:rFonts w:ascii="Calibri" w:hAnsi="Calibri"/>
           <w:color w:val="374151"/>
-          <w:sz w:val="22"/>
-        </w:rPr>
-        <w:t>Information and user interface components must be presentable to users in ways they can perceive. All decorative SVG graphics include aria-hidden='true' to eliminate screen reader clutter. Informative indicators provide programmatic text alternatives via .visually-hidden spans. Text contrast exceeds the mandatory 4.5:1 ratio across all modes.</w:t>
-      </w:r>
-    </w:p>
-    <w:p>
-      <w:pPr>
-        <w:pStyle w:val="Heading2"/>
+        </w:rPr>
+        <w:t xml:space="preserve">Information and user interface components must be presentable to users in ways they can perceive. All decorative SVG graphics include aria-hidden='true' to eliminate screen reader clutter. Informative indicators provide programmatic text alternatives </w:t>
+      </w:r>
+      <w:proofErr w:type="gramStart"/>
+      <w:r>
+        <w:rPr>
+          <w:color w:val="374151"/>
+        </w:rPr>
+        <w:t>via .visually</w:t>
+      </w:r>
+      <w:proofErr w:type="gramEnd"/>
+      <w:r>
+        <w:rPr>
+          <w:color w:val="374151"/>
+        </w:rPr>
+        <w:t>-hidden spans. Text contrast exceeds the mandatory 4.5:1 ratio across all modes.</w:t>
+      </w:r>
+    </w:p>
+    <w:p>
+      <w:pPr>
         <w:spacing w:before="200" w:after="80"/>
       </w:pPr>
       <w:r>
         <w:rPr>
-          <w:rFonts w:ascii="Calibri" w:hAnsi="Calibri"/>
           <w:b/>
           <w:color w:val="2563EB"/>
           <w:sz w:val="26"/>
@@ -513,21 +619,17 @@
       </w:pPr>
       <w:r>
         <w:rPr>
-          <w:rFonts w:ascii="Calibri" w:hAnsi="Calibri"/>
           <w:color w:val="374151"/>
-          <w:sz w:val="22"/>
         </w:rPr>
         <w:t>Interface components and navigation must be operable via any input modality. Every interactive control is fully keyboard operable. Skip links allow users to bypass repetitive content. Focus visible rings are explicitly styled with 3px solid outlines, and keyboard traps have been audited and eliminated.</w:t>
       </w:r>
     </w:p>
     <w:p>
       <w:pPr>
-        <w:pStyle w:val="Heading2"/>
         <w:spacing w:before="200" w:after="80"/>
       </w:pPr>
       <w:r>
         <w:rPr>
-          <w:rFonts w:ascii="Calibri" w:hAnsi="Calibri"/>
           <w:b/>
           <w:color w:val="2563EB"/>
           <w:sz w:val="26"/>
@@ -541,21 +643,31 @@
       </w:pPr>
       <w:r>
         <w:rPr>
-          <w:rFonts w:ascii="Calibri" w:hAnsi="Calibri"/>
           <w:color w:val="374151"/>
-          <w:sz w:val="22"/>
-        </w:rPr>
-        <w:t>Information and operation of the user interface must be understandable. Form fields provide explicit label associations, inline error messages linked through aria-describedby, and dynamic input state notifications via aria-invalid='true/false'.</w:t>
-      </w:r>
-    </w:p>
-    <w:p>
-      <w:pPr>
-        <w:pStyle w:val="Heading2"/>
+        </w:rPr>
+        <w:t>Information and operation of the user interface must be understandable. Form fields provide explicit label associations, inline error messages linked through aria-</w:t>
+      </w:r>
+      <w:proofErr w:type="spellStart"/>
+      <w:r>
+        <w:rPr>
+          <w:color w:val="374151"/>
+        </w:rPr>
+        <w:t>describedby</w:t>
+      </w:r>
+      <w:proofErr w:type="spellEnd"/>
+      <w:r>
+        <w:rPr>
+          <w:color w:val="374151"/>
+        </w:rPr>
+        <w:t>, and dynamic input state notifications via aria-invalid='true/false'.</w:t>
+      </w:r>
+    </w:p>
+    <w:p>
+      <w:pPr>
         <w:spacing w:before="200" w:after="80"/>
       </w:pPr>
       <w:r>
         <w:rPr>
-          <w:rFonts w:ascii="Calibri" w:hAnsi="Calibri"/>
           <w:b/>
           <w:color w:val="2563EB"/>
           <w:sz w:val="26"/>
@@ -569,25 +681,52 @@
       </w:pPr>
       <w:r>
         <w:rPr>
-          <w:rFonts w:ascii="Calibri" w:hAnsi="Calibri"/>
           <w:color w:val="374151"/>
-          <w:sz w:val="22"/>
         </w:rPr>
         <w:t>Content must be robust enough to be interpreted reliably by a wide variety of user agents, including assistive technologies. Standard semantic HTML5 tags are used exclusively, augmented with WAI-ARIA 1.2 roles and state attributes where dynamic state transitions occur.</w:t>
       </w:r>
     </w:p>
     <w:p>
       <w:pPr>
-        <w:pStyle w:val="Heading1"/>
         <w:spacing w:before="280" w:after="120"/>
-      </w:pPr>
-      <w:r>
-        <w:rPr>
-          <w:rFonts w:ascii="Calibri" w:hAnsi="Calibri"/>
+        <w:rPr>
           <w:b/>
           <w:color w:val="1E3A8A"/>
           <w:sz w:val="32"/>
         </w:rPr>
+      </w:pPr>
+    </w:p>
+    <w:p>
+      <w:pPr>
+        <w:spacing w:before="280" w:after="120"/>
+        <w:rPr>
+          <w:b/>
+          <w:color w:val="1E3A8A"/>
+          <w:sz w:val="32"/>
+        </w:rPr>
+      </w:pPr>
+    </w:p>
+    <w:p>
+      <w:pPr>
+        <w:spacing w:before="280" w:after="120"/>
+        <w:rPr>
+          <w:b/>
+          <w:color w:val="1E3A8A"/>
+          <w:sz w:val="32"/>
+        </w:rPr>
+      </w:pPr>
+    </w:p>
+    <w:p>
+      <w:pPr>
+        <w:spacing w:before="280" w:after="120"/>
+      </w:pPr>
+      <w:r>
+        <w:rPr>
+          <w:b/>
+          <w:color w:val="1E3A8A"/>
+          <w:sz w:val="32"/>
+        </w:rPr>
+        <w:lastRenderedPageBreak/>
         <w:t>4. Color Contrast Audit &amp; Ergonomics</w:t>
       </w:r>
     </w:p>
@@ -597,16 +736,43 @@
       </w:pPr>
       <w:r>
         <w:rPr>
-          <w:rFonts w:ascii="Calibri" w:hAnsi="Calibri"/>
           <w:color w:val="374151"/>
-          <w:sz w:val="22"/>
-        </w:rPr>
-        <w:t>Color contrast was measured across three distinct visual themes using WebAIM and Chrome DevTools accessibility inspection tools:</w:t>
+        </w:rPr>
+        <w:t xml:space="preserve">Color contrast was measured across three distinct visual themes using </w:t>
+      </w:r>
+      <w:proofErr w:type="spellStart"/>
+      <w:r>
+        <w:rPr>
+          <w:color w:val="374151"/>
+        </w:rPr>
+        <w:t>WebAIM</w:t>
+      </w:r>
+      <w:proofErr w:type="spellEnd"/>
+      <w:r>
+        <w:rPr>
+          <w:color w:val="374151"/>
+        </w:rPr>
+        <w:t xml:space="preserve"> and Chrome </w:t>
+      </w:r>
+      <w:proofErr w:type="spellStart"/>
+      <w:r>
+        <w:rPr>
+          <w:color w:val="374151"/>
+        </w:rPr>
+        <w:t>DevTools</w:t>
+      </w:r>
+      <w:proofErr w:type="spellEnd"/>
+      <w:r>
+        <w:rPr>
+          <w:color w:val="374151"/>
+        </w:rPr>
+        <w:t xml:space="preserve"> accessibility inspection tools:</w:t>
       </w:r>
     </w:p>
     <w:tbl>
       <w:tblPr>
         <w:tblW w:w="9200" w:type="dxa"/>
+        <w:tblInd w:w="120" w:type="dxa"/>
         <w:tblBorders>
           <w:top w:val="single" w:sz="4" w:space="0" w:color="D1D5DB"/>
           <w:left w:val="single" w:sz="4" w:space="0" w:color="D1D5DB"/>
@@ -621,10 +787,20 @@
           <w:bottom w:w="80" w:type="dxa"/>
           <w:right w:w="120" w:type="dxa"/>
         </w:tblCellMar>
+        <w:tblLook w:val="04A0" w:firstRow="1" w:lastRow="0" w:firstColumn="1" w:lastColumn="0" w:noHBand="0" w:noVBand="1"/>
       </w:tblPr>
+      <w:tblGrid>
+        <w:gridCol w:w="1145"/>
+        <w:gridCol w:w="1994"/>
+        <w:gridCol w:w="1804"/>
+        <w:gridCol w:w="1325"/>
+        <w:gridCol w:w="1434"/>
+        <w:gridCol w:w="1498"/>
+      </w:tblGrid>
       <w:tr>
         <w:tc>
           <w:tcPr>
+            <w:tcW w:w="0" w:type="auto"/>
             <w:shd w:val="clear" w:color="auto" w:fill="1E3A8A"/>
           </w:tcPr>
           <w:p>
@@ -643,6 +819,7 @@
         </w:tc>
         <w:tc>
           <w:tcPr>
+            <w:tcW w:w="0" w:type="auto"/>
             <w:shd w:val="clear" w:color="auto" w:fill="1E3A8A"/>
           </w:tcPr>
           <w:p>
@@ -661,6 +838,7 @@
         </w:tc>
         <w:tc>
           <w:tcPr>
+            <w:tcW w:w="0" w:type="auto"/>
             <w:shd w:val="clear" w:color="auto" w:fill="1E3A8A"/>
           </w:tcPr>
           <w:p>
@@ -679,6 +857,7 @@
         </w:tc>
         <w:tc>
           <w:tcPr>
+            <w:tcW w:w="0" w:type="auto"/>
             <w:shd w:val="clear" w:color="auto" w:fill="1E3A8A"/>
           </w:tcPr>
           <w:p>
@@ -697,6 +876,7 @@
         </w:tc>
         <w:tc>
           <w:tcPr>
+            <w:tcW w:w="0" w:type="auto"/>
             <w:shd w:val="clear" w:color="auto" w:fill="1E3A8A"/>
           </w:tcPr>
           <w:p>
@@ -715,6 +895,7 @@
         </w:tc>
         <w:tc>
           <w:tcPr>
+            <w:tcW w:w="0" w:type="auto"/>
             <w:shd w:val="clear" w:color="auto" w:fill="1E3A8A"/>
           </w:tcPr>
           <w:p>
@@ -735,6 +916,7 @@
       <w:tr>
         <w:tc>
           <w:tcPr>
+            <w:tcW w:w="0" w:type="auto"/>
             <w:shd w:val="clear" w:color="auto" w:fill="FFFFFF"/>
           </w:tcPr>
           <w:p>
@@ -752,6 +934,7 @@
         </w:tc>
         <w:tc>
           <w:tcPr>
+            <w:tcW w:w="0" w:type="auto"/>
             <w:shd w:val="clear" w:color="auto" w:fill="FFFFFF"/>
           </w:tcPr>
           <w:p>
@@ -769,6 +952,7 @@
         </w:tc>
         <w:tc>
           <w:tcPr>
+            <w:tcW w:w="0" w:type="auto"/>
             <w:shd w:val="clear" w:color="auto" w:fill="FFFFFF"/>
           </w:tcPr>
           <w:p>
@@ -786,40 +970,61 @@
         </w:tc>
         <w:tc>
           <w:tcPr>
-            <w:shd w:val="clear" w:color="auto" w:fill="FFFFFF"/>
-          </w:tcPr>
-          <w:p>
-            <w:pPr>
-              <w:spacing w:before="60" w:after="60"/>
-            </w:pPr>
-            <w:r>
-              <w:rPr>
-                <w:color w:val="374151"/>
-                <w:sz w:val="20"/>
-              </w:rPr>
-              <w:t>18.2 : 1</w:t>
-            </w:r>
-          </w:p>
-        </w:tc>
-        <w:tc>
-          <w:tcPr>
-            <w:shd w:val="clear" w:color="auto" w:fill="FFFFFF"/>
-          </w:tcPr>
-          <w:p>
-            <w:pPr>
-              <w:spacing w:before="60" w:after="60"/>
-            </w:pPr>
-            <w:r>
-              <w:rPr>
-                <w:color w:val="374151"/>
-                <w:sz w:val="20"/>
-              </w:rPr>
-              <w:t>4.5 : 1 (Normal)</w:t>
-            </w:r>
-          </w:p>
-        </w:tc>
-        <w:tc>
-          <w:tcPr>
+            <w:tcW w:w="0" w:type="auto"/>
+            <w:shd w:val="clear" w:color="auto" w:fill="FFFFFF"/>
+          </w:tcPr>
+          <w:p>
+            <w:pPr>
+              <w:spacing w:before="60" w:after="60"/>
+            </w:pPr>
+            <w:proofErr w:type="gramStart"/>
+            <w:r>
+              <w:rPr>
+                <w:color w:val="374151"/>
+                <w:sz w:val="20"/>
+              </w:rPr>
+              <w:t>18.2 :</w:t>
+            </w:r>
+            <w:proofErr w:type="gramEnd"/>
+            <w:r>
+              <w:rPr>
+                <w:color w:val="374151"/>
+                <w:sz w:val="20"/>
+              </w:rPr>
+              <w:t xml:space="preserve"> 1</w:t>
+            </w:r>
+          </w:p>
+        </w:tc>
+        <w:tc>
+          <w:tcPr>
+            <w:tcW w:w="0" w:type="auto"/>
+            <w:shd w:val="clear" w:color="auto" w:fill="FFFFFF"/>
+          </w:tcPr>
+          <w:p>
+            <w:pPr>
+              <w:spacing w:before="60" w:after="60"/>
+            </w:pPr>
+            <w:proofErr w:type="gramStart"/>
+            <w:r>
+              <w:rPr>
+                <w:color w:val="374151"/>
+                <w:sz w:val="20"/>
+              </w:rPr>
+              <w:t>4.5 :</w:t>
+            </w:r>
+            <w:proofErr w:type="gramEnd"/>
+            <w:r>
+              <w:rPr>
+                <w:color w:val="374151"/>
+                <w:sz w:val="20"/>
+              </w:rPr>
+              <w:t xml:space="preserve"> 1 (Normal)</w:t>
+            </w:r>
+          </w:p>
+        </w:tc>
+        <w:tc>
+          <w:tcPr>
+            <w:tcW w:w="0" w:type="auto"/>
             <w:shd w:val="clear" w:color="auto" w:fill="FFFFFF"/>
           </w:tcPr>
           <w:p>
@@ -839,6 +1044,7 @@
       <w:tr>
         <w:tc>
           <w:tcPr>
+            <w:tcW w:w="0" w:type="auto"/>
             <w:shd w:val="clear" w:color="auto" w:fill="F9FAFB"/>
           </w:tcPr>
           <w:p>
@@ -856,6 +1062,7 @@
         </w:tc>
         <w:tc>
           <w:tcPr>
+            <w:tcW w:w="0" w:type="auto"/>
             <w:shd w:val="clear" w:color="auto" w:fill="F9FAFB"/>
           </w:tcPr>
           <w:p>
@@ -873,6 +1080,7 @@
         </w:tc>
         <w:tc>
           <w:tcPr>
+            <w:tcW w:w="0" w:type="auto"/>
             <w:shd w:val="clear" w:color="auto" w:fill="F9FAFB"/>
           </w:tcPr>
           <w:p>
@@ -890,40 +1098,61 @@
         </w:tc>
         <w:tc>
           <w:tcPr>
+            <w:tcW w:w="0" w:type="auto"/>
             <w:shd w:val="clear" w:color="auto" w:fill="F9FAFB"/>
           </w:tcPr>
           <w:p>
             <w:pPr>
               <w:spacing w:before="60" w:after="60"/>
             </w:pPr>
-            <w:r>
-              <w:rPr>
-                <w:color w:val="374151"/>
-                <w:sz w:val="20"/>
-              </w:rPr>
-              <w:t>6.8 : 1</w:t>
-            </w:r>
-          </w:p>
-        </w:tc>
-        <w:tc>
-          <w:tcPr>
+            <w:proofErr w:type="gramStart"/>
+            <w:r>
+              <w:rPr>
+                <w:color w:val="374151"/>
+                <w:sz w:val="20"/>
+              </w:rPr>
+              <w:t>6.8 :</w:t>
+            </w:r>
+            <w:proofErr w:type="gramEnd"/>
+            <w:r>
+              <w:rPr>
+                <w:color w:val="374151"/>
+                <w:sz w:val="20"/>
+              </w:rPr>
+              <w:t xml:space="preserve"> 1</w:t>
+            </w:r>
+          </w:p>
+        </w:tc>
+        <w:tc>
+          <w:tcPr>
+            <w:tcW w:w="0" w:type="auto"/>
             <w:shd w:val="clear" w:color="auto" w:fill="F9FAFB"/>
           </w:tcPr>
           <w:p>
             <w:pPr>
               <w:spacing w:before="60" w:after="60"/>
             </w:pPr>
-            <w:r>
-              <w:rPr>
-                <w:color w:val="374151"/>
-                <w:sz w:val="20"/>
-              </w:rPr>
-              <w:t>4.5 : 1 (Normal)</w:t>
-            </w:r>
-          </w:p>
-        </w:tc>
-        <w:tc>
-          <w:tcPr>
+            <w:proofErr w:type="gramStart"/>
+            <w:r>
+              <w:rPr>
+                <w:color w:val="374151"/>
+                <w:sz w:val="20"/>
+              </w:rPr>
+              <w:t>4.5 :</w:t>
+            </w:r>
+            <w:proofErr w:type="gramEnd"/>
+            <w:r>
+              <w:rPr>
+                <w:color w:val="374151"/>
+                <w:sz w:val="20"/>
+              </w:rPr>
+              <w:t xml:space="preserve"> 1 (Normal)</w:t>
+            </w:r>
+          </w:p>
+        </w:tc>
+        <w:tc>
+          <w:tcPr>
+            <w:tcW w:w="0" w:type="auto"/>
             <w:shd w:val="clear" w:color="auto" w:fill="F9FAFB"/>
           </w:tcPr>
           <w:p>
@@ -943,6 +1172,7 @@
       <w:tr>
         <w:tc>
           <w:tcPr>
+            <w:tcW w:w="0" w:type="auto"/>
             <w:shd w:val="clear" w:color="auto" w:fill="FFFFFF"/>
           </w:tcPr>
           <w:p>
@@ -960,6 +1190,7 @@
         </w:tc>
         <w:tc>
           <w:tcPr>
+            <w:tcW w:w="0" w:type="auto"/>
             <w:shd w:val="clear" w:color="auto" w:fill="FFFFFF"/>
           </w:tcPr>
           <w:p>
@@ -977,6 +1208,7 @@
         </w:tc>
         <w:tc>
           <w:tcPr>
+            <w:tcW w:w="0" w:type="auto"/>
             <w:shd w:val="clear" w:color="auto" w:fill="FFFFFF"/>
           </w:tcPr>
           <w:p>
@@ -994,40 +1226,61 @@
         </w:tc>
         <w:tc>
           <w:tcPr>
-            <w:shd w:val="clear" w:color="auto" w:fill="FFFFFF"/>
-          </w:tcPr>
-          <w:p>
-            <w:pPr>
-              <w:spacing w:before="60" w:after="60"/>
-            </w:pPr>
-            <w:r>
-              <w:rPr>
-                <w:color w:val="374151"/>
-                <w:sz w:val="20"/>
-              </w:rPr>
-              <w:t>7.4 : 1</w:t>
-            </w:r>
-          </w:p>
-        </w:tc>
-        <w:tc>
-          <w:tcPr>
-            <w:shd w:val="clear" w:color="auto" w:fill="FFFFFF"/>
-          </w:tcPr>
-          <w:p>
-            <w:pPr>
-              <w:spacing w:before="60" w:after="60"/>
-            </w:pPr>
-            <w:r>
-              <w:rPr>
-                <w:color w:val="374151"/>
-                <w:sz w:val="20"/>
-              </w:rPr>
-              <w:t>4.5 : 1 (Normal)</w:t>
-            </w:r>
-          </w:p>
-        </w:tc>
-        <w:tc>
-          <w:tcPr>
+            <w:tcW w:w="0" w:type="auto"/>
+            <w:shd w:val="clear" w:color="auto" w:fill="FFFFFF"/>
+          </w:tcPr>
+          <w:p>
+            <w:pPr>
+              <w:spacing w:before="60" w:after="60"/>
+            </w:pPr>
+            <w:proofErr w:type="gramStart"/>
+            <w:r>
+              <w:rPr>
+                <w:color w:val="374151"/>
+                <w:sz w:val="20"/>
+              </w:rPr>
+              <w:t>7.4 :</w:t>
+            </w:r>
+            <w:proofErr w:type="gramEnd"/>
+            <w:r>
+              <w:rPr>
+                <w:color w:val="374151"/>
+                <w:sz w:val="20"/>
+              </w:rPr>
+              <w:t xml:space="preserve"> 1</w:t>
+            </w:r>
+          </w:p>
+        </w:tc>
+        <w:tc>
+          <w:tcPr>
+            <w:tcW w:w="0" w:type="auto"/>
+            <w:shd w:val="clear" w:color="auto" w:fill="FFFFFF"/>
+          </w:tcPr>
+          <w:p>
+            <w:pPr>
+              <w:spacing w:before="60" w:after="60"/>
+            </w:pPr>
+            <w:proofErr w:type="gramStart"/>
+            <w:r>
+              <w:rPr>
+                <w:color w:val="374151"/>
+                <w:sz w:val="20"/>
+              </w:rPr>
+              <w:t>4.5 :</w:t>
+            </w:r>
+            <w:proofErr w:type="gramEnd"/>
+            <w:r>
+              <w:rPr>
+                <w:color w:val="374151"/>
+                <w:sz w:val="20"/>
+              </w:rPr>
+              <w:t xml:space="preserve"> 1 (Normal)</w:t>
+            </w:r>
+          </w:p>
+        </w:tc>
+        <w:tc>
+          <w:tcPr>
+            <w:tcW w:w="0" w:type="auto"/>
             <w:shd w:val="clear" w:color="auto" w:fill="FFFFFF"/>
           </w:tcPr>
           <w:p>
@@ -1047,6 +1300,7 @@
       <w:tr>
         <w:tc>
           <w:tcPr>
+            <w:tcW w:w="0" w:type="auto"/>
             <w:shd w:val="clear" w:color="auto" w:fill="F9FAFB"/>
           </w:tcPr>
           <w:p>
@@ -1064,6 +1318,7 @@
         </w:tc>
         <w:tc>
           <w:tcPr>
+            <w:tcW w:w="0" w:type="auto"/>
             <w:shd w:val="clear" w:color="auto" w:fill="F9FAFB"/>
           </w:tcPr>
           <w:p>
@@ -1081,6 +1336,7 @@
         </w:tc>
         <w:tc>
           <w:tcPr>
+            <w:tcW w:w="0" w:type="auto"/>
             <w:shd w:val="clear" w:color="auto" w:fill="F9FAFB"/>
           </w:tcPr>
           <w:p>
@@ -1098,40 +1354,61 @@
         </w:tc>
         <w:tc>
           <w:tcPr>
+            <w:tcW w:w="0" w:type="auto"/>
             <w:shd w:val="clear" w:color="auto" w:fill="F9FAFB"/>
           </w:tcPr>
           <w:p>
             <w:pPr>
               <w:spacing w:before="60" w:after="60"/>
             </w:pPr>
-            <w:r>
-              <w:rPr>
-                <w:color w:val="374151"/>
-                <w:sz w:val="20"/>
-              </w:rPr>
-              <w:t>21.0 : 1</w:t>
-            </w:r>
-          </w:p>
-        </w:tc>
-        <w:tc>
-          <w:tcPr>
+            <w:proofErr w:type="gramStart"/>
+            <w:r>
+              <w:rPr>
+                <w:color w:val="374151"/>
+                <w:sz w:val="20"/>
+              </w:rPr>
+              <w:t>21.0 :</w:t>
+            </w:r>
+            <w:proofErr w:type="gramEnd"/>
+            <w:r>
+              <w:rPr>
+                <w:color w:val="374151"/>
+                <w:sz w:val="20"/>
+              </w:rPr>
+              <w:t xml:space="preserve"> 1</w:t>
+            </w:r>
+          </w:p>
+        </w:tc>
+        <w:tc>
+          <w:tcPr>
+            <w:tcW w:w="0" w:type="auto"/>
             <w:shd w:val="clear" w:color="auto" w:fill="F9FAFB"/>
           </w:tcPr>
           <w:p>
             <w:pPr>
               <w:spacing w:before="60" w:after="60"/>
             </w:pPr>
-            <w:r>
-              <w:rPr>
-                <w:color w:val="374151"/>
-                <w:sz w:val="20"/>
-              </w:rPr>
-              <w:t>7.0 : 1 (AAA)</w:t>
-            </w:r>
-          </w:p>
-        </w:tc>
-        <w:tc>
-          <w:tcPr>
+            <w:proofErr w:type="gramStart"/>
+            <w:r>
+              <w:rPr>
+                <w:color w:val="374151"/>
+                <w:sz w:val="20"/>
+              </w:rPr>
+              <w:t>7.0 :</w:t>
+            </w:r>
+            <w:proofErr w:type="gramEnd"/>
+            <w:r>
+              <w:rPr>
+                <w:color w:val="374151"/>
+                <w:sz w:val="20"/>
+              </w:rPr>
+              <w:t xml:space="preserve"> 1 (AAA)</w:t>
+            </w:r>
+          </w:p>
+        </w:tc>
+        <w:tc>
+          <w:tcPr>
+            <w:tcW w:w="0" w:type="auto"/>
             <w:shd w:val="clear" w:color="auto" w:fill="F9FAFB"/>
           </w:tcPr>
           <w:p>
@@ -1151,6 +1428,7 @@
       <w:tr>
         <w:tc>
           <w:tcPr>
+            <w:tcW w:w="0" w:type="auto"/>
             <w:shd w:val="clear" w:color="auto" w:fill="FFFFFF"/>
           </w:tcPr>
           <w:p>
@@ -1168,6 +1446,7 @@
         </w:tc>
         <w:tc>
           <w:tcPr>
+            <w:tcW w:w="0" w:type="auto"/>
             <w:shd w:val="clear" w:color="auto" w:fill="FFFFFF"/>
           </w:tcPr>
           <w:p>
@@ -1185,6 +1464,7 @@
         </w:tc>
         <w:tc>
           <w:tcPr>
+            <w:tcW w:w="0" w:type="auto"/>
             <w:shd w:val="clear" w:color="auto" w:fill="FFFFFF"/>
           </w:tcPr>
           <w:p>
@@ -1202,40 +1482,61 @@
         </w:tc>
         <w:tc>
           <w:tcPr>
-            <w:shd w:val="clear" w:color="auto" w:fill="FFFFFF"/>
-          </w:tcPr>
-          <w:p>
-            <w:pPr>
-              <w:spacing w:before="60" w:after="60"/>
-            </w:pPr>
-            <w:r>
-              <w:rPr>
-                <w:color w:val="374151"/>
-                <w:sz w:val="20"/>
-              </w:rPr>
-              <w:t>19.6 : 1</w:t>
-            </w:r>
-          </w:p>
-        </w:tc>
-        <w:tc>
-          <w:tcPr>
-            <w:shd w:val="clear" w:color="auto" w:fill="FFFFFF"/>
-          </w:tcPr>
-          <w:p>
-            <w:pPr>
-              <w:spacing w:before="60" w:after="60"/>
-            </w:pPr>
-            <w:r>
-              <w:rPr>
-                <w:color w:val="374151"/>
-                <w:sz w:val="20"/>
-              </w:rPr>
-              <w:t>7.0 : 1 (AAA)</w:t>
-            </w:r>
-          </w:p>
-        </w:tc>
-        <w:tc>
-          <w:tcPr>
+            <w:tcW w:w="0" w:type="auto"/>
+            <w:shd w:val="clear" w:color="auto" w:fill="FFFFFF"/>
+          </w:tcPr>
+          <w:p>
+            <w:pPr>
+              <w:spacing w:before="60" w:after="60"/>
+            </w:pPr>
+            <w:proofErr w:type="gramStart"/>
+            <w:r>
+              <w:rPr>
+                <w:color w:val="374151"/>
+                <w:sz w:val="20"/>
+              </w:rPr>
+              <w:t>19.6 :</w:t>
+            </w:r>
+            <w:proofErr w:type="gramEnd"/>
+            <w:r>
+              <w:rPr>
+                <w:color w:val="374151"/>
+                <w:sz w:val="20"/>
+              </w:rPr>
+              <w:t xml:space="preserve"> 1</w:t>
+            </w:r>
+          </w:p>
+        </w:tc>
+        <w:tc>
+          <w:tcPr>
+            <w:tcW w:w="0" w:type="auto"/>
+            <w:shd w:val="clear" w:color="auto" w:fill="FFFFFF"/>
+          </w:tcPr>
+          <w:p>
+            <w:pPr>
+              <w:spacing w:before="60" w:after="60"/>
+            </w:pPr>
+            <w:proofErr w:type="gramStart"/>
+            <w:r>
+              <w:rPr>
+                <w:color w:val="374151"/>
+                <w:sz w:val="20"/>
+              </w:rPr>
+              <w:t>7.0 :</w:t>
+            </w:r>
+            <w:proofErr w:type="gramEnd"/>
+            <w:r>
+              <w:rPr>
+                <w:color w:val="374151"/>
+                <w:sz w:val="20"/>
+              </w:rPr>
+              <w:t xml:space="preserve"> 1 (AAA)</w:t>
+            </w:r>
+          </w:p>
+        </w:tc>
+        <w:tc>
+          <w:tcPr>
+            <w:tcW w:w="0" w:type="auto"/>
             <w:shd w:val="clear" w:color="auto" w:fill="FFFFFF"/>
           </w:tcPr>
           <w:p>
@@ -1255,6 +1556,7 @@
       <w:tr>
         <w:tc>
           <w:tcPr>
+            <w:tcW w:w="0" w:type="auto"/>
             <w:shd w:val="clear" w:color="auto" w:fill="F9FAFB"/>
           </w:tcPr>
           <w:p>
@@ -1272,6 +1574,7 @@
         </w:tc>
         <w:tc>
           <w:tcPr>
+            <w:tcW w:w="0" w:type="auto"/>
             <w:shd w:val="clear" w:color="auto" w:fill="F9FAFB"/>
           </w:tcPr>
           <w:p>
@@ -1289,6 +1592,7 @@
         </w:tc>
         <w:tc>
           <w:tcPr>
+            <w:tcW w:w="0" w:type="auto"/>
             <w:shd w:val="clear" w:color="auto" w:fill="F9FAFB"/>
           </w:tcPr>
           <w:p>
@@ -1306,40 +1610,61 @@
         </w:tc>
         <w:tc>
           <w:tcPr>
+            <w:tcW w:w="0" w:type="auto"/>
             <w:shd w:val="clear" w:color="auto" w:fill="F9FAFB"/>
           </w:tcPr>
           <w:p>
             <w:pPr>
               <w:spacing w:before="60" w:after="60"/>
             </w:pPr>
-            <w:r>
-              <w:rPr>
-                <w:color w:val="374151"/>
-                <w:sz w:val="20"/>
-              </w:rPr>
-              <w:t>16.1 : 1</w:t>
-            </w:r>
-          </w:p>
-        </w:tc>
-        <w:tc>
-          <w:tcPr>
+            <w:proofErr w:type="gramStart"/>
+            <w:r>
+              <w:rPr>
+                <w:color w:val="374151"/>
+                <w:sz w:val="20"/>
+              </w:rPr>
+              <w:t>16.1 :</w:t>
+            </w:r>
+            <w:proofErr w:type="gramEnd"/>
+            <w:r>
+              <w:rPr>
+                <w:color w:val="374151"/>
+                <w:sz w:val="20"/>
+              </w:rPr>
+              <w:t xml:space="preserve"> 1</w:t>
+            </w:r>
+          </w:p>
+        </w:tc>
+        <w:tc>
+          <w:tcPr>
+            <w:tcW w:w="0" w:type="auto"/>
             <w:shd w:val="clear" w:color="auto" w:fill="F9FAFB"/>
           </w:tcPr>
           <w:p>
             <w:pPr>
               <w:spacing w:before="60" w:after="60"/>
             </w:pPr>
-            <w:r>
-              <w:rPr>
-                <w:color w:val="374151"/>
-                <w:sz w:val="20"/>
-              </w:rPr>
-              <w:t>4.5 : 1 (Normal)</w:t>
-            </w:r>
-          </w:p>
-        </w:tc>
-        <w:tc>
-          <w:tcPr>
+            <w:proofErr w:type="gramStart"/>
+            <w:r>
+              <w:rPr>
+                <w:color w:val="374151"/>
+                <w:sz w:val="20"/>
+              </w:rPr>
+              <w:t>4.5 :</w:t>
+            </w:r>
+            <w:proofErr w:type="gramEnd"/>
+            <w:r>
+              <w:rPr>
+                <w:color w:val="374151"/>
+                <w:sz w:val="20"/>
+              </w:rPr>
+              <w:t xml:space="preserve"> 1 (Normal)</w:t>
+            </w:r>
+          </w:p>
+        </w:tc>
+        <w:tc>
+          <w:tcPr>
+            <w:tcW w:w="0" w:type="auto"/>
             <w:shd w:val="clear" w:color="auto" w:fill="F9FAFB"/>
           </w:tcPr>
           <w:p>
@@ -1359,6 +1684,7 @@
       <w:tr>
         <w:tc>
           <w:tcPr>
+            <w:tcW w:w="0" w:type="auto"/>
             <w:shd w:val="clear" w:color="auto" w:fill="FFFFFF"/>
           </w:tcPr>
           <w:p>
@@ -1376,6 +1702,7 @@
         </w:tc>
         <w:tc>
           <w:tcPr>
+            <w:tcW w:w="0" w:type="auto"/>
             <w:shd w:val="clear" w:color="auto" w:fill="FFFFFF"/>
           </w:tcPr>
           <w:p>
@@ -1393,6 +1720,7 @@
         </w:tc>
         <w:tc>
           <w:tcPr>
+            <w:tcW w:w="0" w:type="auto"/>
             <w:shd w:val="clear" w:color="auto" w:fill="FFFFFF"/>
           </w:tcPr>
           <w:p>
@@ -1410,40 +1738,61 @@
         </w:tc>
         <w:tc>
           <w:tcPr>
-            <w:shd w:val="clear" w:color="auto" w:fill="FFFFFF"/>
-          </w:tcPr>
-          <w:p>
-            <w:pPr>
-              <w:spacing w:before="60" w:after="60"/>
-            </w:pPr>
-            <w:r>
-              <w:rPr>
-                <w:color w:val="374151"/>
-                <w:sz w:val="20"/>
-              </w:rPr>
-              <w:t>7.1 : 1</w:t>
-            </w:r>
-          </w:p>
-        </w:tc>
-        <w:tc>
-          <w:tcPr>
-            <w:shd w:val="clear" w:color="auto" w:fill="FFFFFF"/>
-          </w:tcPr>
-          <w:p>
-            <w:pPr>
-              <w:spacing w:before="60" w:after="60"/>
-            </w:pPr>
-            <w:r>
-              <w:rPr>
-                <w:color w:val="374151"/>
-                <w:sz w:val="20"/>
-              </w:rPr>
-              <w:t>4.5 : 1 (Normal)</w:t>
-            </w:r>
-          </w:p>
-        </w:tc>
-        <w:tc>
-          <w:tcPr>
+            <w:tcW w:w="0" w:type="auto"/>
+            <w:shd w:val="clear" w:color="auto" w:fill="FFFFFF"/>
+          </w:tcPr>
+          <w:p>
+            <w:pPr>
+              <w:spacing w:before="60" w:after="60"/>
+            </w:pPr>
+            <w:proofErr w:type="gramStart"/>
+            <w:r>
+              <w:rPr>
+                <w:color w:val="374151"/>
+                <w:sz w:val="20"/>
+              </w:rPr>
+              <w:t>7.1 :</w:t>
+            </w:r>
+            <w:proofErr w:type="gramEnd"/>
+            <w:r>
+              <w:rPr>
+                <w:color w:val="374151"/>
+                <w:sz w:val="20"/>
+              </w:rPr>
+              <w:t xml:space="preserve"> 1</w:t>
+            </w:r>
+          </w:p>
+        </w:tc>
+        <w:tc>
+          <w:tcPr>
+            <w:tcW w:w="0" w:type="auto"/>
+            <w:shd w:val="clear" w:color="auto" w:fill="FFFFFF"/>
+          </w:tcPr>
+          <w:p>
+            <w:pPr>
+              <w:spacing w:before="60" w:after="60"/>
+            </w:pPr>
+            <w:proofErr w:type="gramStart"/>
+            <w:r>
+              <w:rPr>
+                <w:color w:val="374151"/>
+                <w:sz w:val="20"/>
+              </w:rPr>
+              <w:t>4.5 :</w:t>
+            </w:r>
+            <w:proofErr w:type="gramEnd"/>
+            <w:r>
+              <w:rPr>
+                <w:color w:val="374151"/>
+                <w:sz w:val="20"/>
+              </w:rPr>
+              <w:t xml:space="preserve"> 1 (Normal)</w:t>
+            </w:r>
+          </w:p>
+        </w:tc>
+        <w:tc>
+          <w:tcPr>
+            <w:tcW w:w="0" w:type="auto"/>
             <w:shd w:val="clear" w:color="auto" w:fill="FFFFFF"/>
           </w:tcPr>
           <w:p>
@@ -1463,6 +1812,7 @@
       <w:tr>
         <w:tc>
           <w:tcPr>
+            <w:tcW w:w="0" w:type="auto"/>
             <w:shd w:val="clear" w:color="auto" w:fill="F9FAFB"/>
           </w:tcPr>
           <w:p>
@@ -1480,6 +1830,7 @@
         </w:tc>
         <w:tc>
           <w:tcPr>
+            <w:tcW w:w="0" w:type="auto"/>
             <w:shd w:val="clear" w:color="auto" w:fill="F9FAFB"/>
           </w:tcPr>
           <w:p>
@@ -1497,6 +1848,7 @@
         </w:tc>
         <w:tc>
           <w:tcPr>
+            <w:tcW w:w="0" w:type="auto"/>
             <w:shd w:val="clear" w:color="auto" w:fill="F9FAFB"/>
           </w:tcPr>
           <w:p>
@@ -1514,40 +1866,61 @@
         </w:tc>
         <w:tc>
           <w:tcPr>
+            <w:tcW w:w="0" w:type="auto"/>
             <w:shd w:val="clear" w:color="auto" w:fill="F9FAFB"/>
           </w:tcPr>
           <w:p>
             <w:pPr>
               <w:spacing w:before="60" w:after="60"/>
             </w:pPr>
-            <w:r>
-              <w:rPr>
-                <w:color w:val="374151"/>
-                <w:sz w:val="20"/>
-              </w:rPr>
-              <w:t>4.6 : 1</w:t>
-            </w:r>
-          </w:p>
-        </w:tc>
-        <w:tc>
-          <w:tcPr>
+            <w:proofErr w:type="gramStart"/>
+            <w:r>
+              <w:rPr>
+                <w:color w:val="374151"/>
+                <w:sz w:val="20"/>
+              </w:rPr>
+              <w:t>4.6 :</w:t>
+            </w:r>
+            <w:proofErr w:type="gramEnd"/>
+            <w:r>
+              <w:rPr>
+                <w:color w:val="374151"/>
+                <w:sz w:val="20"/>
+              </w:rPr>
+              <w:t xml:space="preserve"> 1</w:t>
+            </w:r>
+          </w:p>
+        </w:tc>
+        <w:tc>
+          <w:tcPr>
+            <w:tcW w:w="0" w:type="auto"/>
             <w:shd w:val="clear" w:color="auto" w:fill="F9FAFB"/>
           </w:tcPr>
           <w:p>
             <w:pPr>
               <w:spacing w:before="60" w:after="60"/>
             </w:pPr>
-            <w:r>
-              <w:rPr>
-                <w:color w:val="374151"/>
-                <w:sz w:val="20"/>
-              </w:rPr>
-              <w:t>4.5 : 1 (Normal)</w:t>
-            </w:r>
-          </w:p>
-        </w:tc>
-        <w:tc>
-          <w:tcPr>
+            <w:proofErr w:type="gramStart"/>
+            <w:r>
+              <w:rPr>
+                <w:color w:val="374151"/>
+                <w:sz w:val="20"/>
+              </w:rPr>
+              <w:t>4.5 :</w:t>
+            </w:r>
+            <w:proofErr w:type="gramEnd"/>
+            <w:r>
+              <w:rPr>
+                <w:color w:val="374151"/>
+                <w:sz w:val="20"/>
+              </w:rPr>
+              <w:t xml:space="preserve"> 1 (Normal)</w:t>
+            </w:r>
+          </w:p>
+        </w:tc>
+        <w:tc>
+          <w:tcPr>
+            <w:tcW w:w="0" w:type="auto"/>
             <w:shd w:val="clear" w:color="auto" w:fill="F9FAFB"/>
           </w:tcPr>
           <w:p>
@@ -1565,23 +1938,68 @@
         </w:tc>
       </w:tr>
     </w:tbl>
-    <w:p>
-      <w:pPr>
-        <w:spacing w:after="160"/>
-      </w:pPr>
-    </w:p>
-    <w:p>
-      <w:pPr>
-        <w:pStyle w:val="Heading1"/>
+    <w:p/>
+    <w:p>
+      <w:pPr>
         <w:spacing w:before="280" w:after="120"/>
-      </w:pPr>
-      <w:r>
-        <w:rPr>
-          <w:rFonts w:ascii="Calibri" w:hAnsi="Calibri"/>
+        <w:rPr>
           <w:b/>
           <w:color w:val="1E3A8A"/>
           <w:sz w:val="32"/>
         </w:rPr>
+      </w:pPr>
+    </w:p>
+    <w:p>
+      <w:pPr>
+        <w:spacing w:before="280" w:after="120"/>
+        <w:rPr>
+          <w:b/>
+          <w:color w:val="1E3A8A"/>
+          <w:sz w:val="32"/>
+        </w:rPr>
+      </w:pPr>
+    </w:p>
+    <w:p>
+      <w:pPr>
+        <w:spacing w:before="280" w:after="120"/>
+        <w:rPr>
+          <w:b/>
+          <w:color w:val="1E3A8A"/>
+          <w:sz w:val="32"/>
+        </w:rPr>
+      </w:pPr>
+    </w:p>
+    <w:p>
+      <w:pPr>
+        <w:spacing w:before="280" w:after="120"/>
+        <w:rPr>
+          <w:b/>
+          <w:color w:val="1E3A8A"/>
+          <w:sz w:val="32"/>
+        </w:rPr>
+      </w:pPr>
+    </w:p>
+    <w:p>
+      <w:pPr>
+        <w:spacing w:before="280" w:after="120"/>
+        <w:rPr>
+          <w:b/>
+          <w:color w:val="1E3A8A"/>
+          <w:sz w:val="32"/>
+        </w:rPr>
+      </w:pPr>
+    </w:p>
+    <w:p>
+      <w:pPr>
+        <w:spacing w:before="280" w:after="120"/>
+      </w:pPr>
+      <w:r>
+        <w:rPr>
+          <w:b/>
+          <w:color w:val="1E3A8A"/>
+          <w:sz w:val="32"/>
+        </w:rPr>
+        <w:lastRenderedPageBreak/>
         <w:t>5. Keyboard Navigation &amp; Focus Management</w:t>
       </w:r>
     </w:p>
@@ -1591,9 +2009,7 @@
       </w:pPr>
       <w:r>
         <w:rPr>
-          <w:rFonts w:ascii="Calibri" w:hAnsi="Calibri"/>
           <w:color w:val="374151"/>
-          <w:sz w:val="22"/>
         </w:rPr>
         <w:t>Keyboard accessibility was audited across all components to ensure predictable focus flow without trap states:</w:t>
       </w:r>
@@ -1601,6 +2017,7 @@
     <w:tbl>
       <w:tblPr>
         <w:tblW w:w="9200" w:type="dxa"/>
+        <w:tblInd w:w="120" w:type="dxa"/>
         <w:tblBorders>
           <w:top w:val="single" w:sz="4" w:space="0" w:color="D1D5DB"/>
           <w:left w:val="single" w:sz="4" w:space="0" w:color="D1D5DB"/>
@@ -1615,10 +2032,18 @@
           <w:bottom w:w="80" w:type="dxa"/>
           <w:right w:w="120" w:type="dxa"/>
         </w:tblCellMar>
+        <w:tblLook w:val="04A0" w:firstRow="1" w:lastRow="0" w:firstColumn="1" w:lastColumn="0" w:noHBand="0" w:noVBand="1"/>
       </w:tblPr>
+      <w:tblGrid>
+        <w:gridCol w:w="1594"/>
+        <w:gridCol w:w="1811"/>
+        <w:gridCol w:w="3054"/>
+        <w:gridCol w:w="2741"/>
+      </w:tblGrid>
       <w:tr>
         <w:tc>
           <w:tcPr>
+            <w:tcW w:w="0" w:type="auto"/>
             <w:shd w:val="clear" w:color="auto" w:fill="1E3A8A"/>
           </w:tcPr>
           <w:p>
@@ -1637,6 +2062,7 @@
         </w:tc>
         <w:tc>
           <w:tcPr>
+            <w:tcW w:w="0" w:type="auto"/>
             <w:shd w:val="clear" w:color="auto" w:fill="1E3A8A"/>
           </w:tcPr>
           <w:p>
@@ -1655,6 +2081,7 @@
         </w:tc>
         <w:tc>
           <w:tcPr>
+            <w:tcW w:w="0" w:type="auto"/>
             <w:shd w:val="clear" w:color="auto" w:fill="1E3A8A"/>
           </w:tcPr>
           <w:p>
@@ -1673,6 +2100,7 @@
         </w:tc>
         <w:tc>
           <w:tcPr>
+            <w:tcW w:w="0" w:type="auto"/>
             <w:shd w:val="clear" w:color="auto" w:fill="1E3A8A"/>
           </w:tcPr>
           <w:p>
@@ -1693,6 +2121,7 @@
       <w:tr>
         <w:tc>
           <w:tcPr>
+            <w:tcW w:w="0" w:type="auto"/>
             <w:shd w:val="clear" w:color="auto" w:fill="FFFFFF"/>
           </w:tcPr>
           <w:p>
@@ -1710,23 +2139,34 @@
         </w:tc>
         <w:tc>
           <w:tcPr>
-            <w:shd w:val="clear" w:color="auto" w:fill="FFFFFF"/>
-          </w:tcPr>
-          <w:p>
-            <w:pPr>
-              <w:spacing w:before="60" w:after="60"/>
-            </w:pPr>
-            <w:r>
-              <w:rPr>
-                <w:color w:val="374151"/>
-                <w:sz w:val="20"/>
-              </w:rPr>
-              <w:t>Tab / Shift+Tab</w:t>
-            </w:r>
-          </w:p>
-        </w:tc>
-        <w:tc>
-          <w:tcPr>
+            <w:tcW w:w="0" w:type="auto"/>
+            <w:shd w:val="clear" w:color="auto" w:fill="FFFFFF"/>
+          </w:tcPr>
+          <w:p>
+            <w:pPr>
+              <w:spacing w:before="60" w:after="60"/>
+            </w:pPr>
+            <w:r>
+              <w:rPr>
+                <w:color w:val="374151"/>
+                <w:sz w:val="20"/>
+              </w:rPr>
+              <w:t xml:space="preserve">Tab / </w:t>
+            </w:r>
+            <w:proofErr w:type="spellStart"/>
+            <w:r>
+              <w:rPr>
+                <w:color w:val="374151"/>
+                <w:sz w:val="20"/>
+              </w:rPr>
+              <w:t>Shift+Tab</w:t>
+            </w:r>
+            <w:proofErr w:type="spellEnd"/>
+          </w:p>
+        </w:tc>
+        <w:tc>
+          <w:tcPr>
+            <w:tcW w:w="0" w:type="auto"/>
             <w:shd w:val="clear" w:color="auto" w:fill="FFFFFF"/>
           </w:tcPr>
           <w:p>
@@ -1744,6 +2184,7 @@
         </w:tc>
         <w:tc>
           <w:tcPr>
+            <w:tcW w:w="0" w:type="auto"/>
             <w:shd w:val="clear" w:color="auto" w:fill="FFFFFF"/>
           </w:tcPr>
           <w:p>
@@ -1763,6 +2204,7 @@
       <w:tr>
         <w:tc>
           <w:tcPr>
+            <w:tcW w:w="0" w:type="auto"/>
             <w:shd w:val="clear" w:color="auto" w:fill="F9FAFB"/>
           </w:tcPr>
           <w:p>
@@ -1780,6 +2222,7 @@
         </w:tc>
         <w:tc>
           <w:tcPr>
+            <w:tcW w:w="0" w:type="auto"/>
             <w:shd w:val="clear" w:color="auto" w:fill="F9FAFB"/>
           </w:tcPr>
           <w:p>
@@ -1797,6 +2240,7 @@
         </w:tc>
         <w:tc>
           <w:tcPr>
+            <w:tcW w:w="0" w:type="auto"/>
             <w:shd w:val="clear" w:color="auto" w:fill="F9FAFB"/>
           </w:tcPr>
           <w:p>
@@ -1814,6 +2258,7 @@
         </w:tc>
         <w:tc>
           <w:tcPr>
+            <w:tcW w:w="0" w:type="auto"/>
             <w:shd w:val="clear" w:color="auto" w:fill="F9FAFB"/>
           </w:tcPr>
           <w:p>
@@ -1825,7 +2270,23 @@
                 <w:color w:val="374151"/>
                 <w:sz w:val="20"/>
               </w:rPr>
-              <w:t>Moves tabindex='-1' programmatic focus</w:t>
+              <w:t xml:space="preserve">Moves </w:t>
+            </w:r>
+            <w:proofErr w:type="spellStart"/>
+            <w:r>
+              <w:rPr>
+                <w:color w:val="374151"/>
+                <w:sz w:val="20"/>
+              </w:rPr>
+              <w:t>tabindex</w:t>
+            </w:r>
+            <w:proofErr w:type="spellEnd"/>
+            <w:r>
+              <w:rPr>
+                <w:color w:val="374151"/>
+                <w:sz w:val="20"/>
+              </w:rPr>
+              <w:t>='-1' programmatic focus</w:t>
             </w:r>
           </w:p>
         </w:tc>
@@ -1833,40 +2294,70 @@
       <w:tr>
         <w:tc>
           <w:tcPr>
-            <w:shd w:val="clear" w:color="auto" w:fill="FFFFFF"/>
-          </w:tcPr>
-          <w:p>
-            <w:pPr>
-              <w:spacing w:before="60" w:after="60"/>
-            </w:pPr>
-            <w:r>
-              <w:rPr>
-                <w:color w:val="374151"/>
-                <w:sz w:val="20"/>
-              </w:rPr>
-              <w:t>Theme Radiogroup</w:t>
-            </w:r>
-          </w:p>
-        </w:tc>
-        <w:tc>
-          <w:tcPr>
-            <w:shd w:val="clear" w:color="auto" w:fill="FFFFFF"/>
-          </w:tcPr>
-          <w:p>
-            <w:pPr>
-              <w:spacing w:before="60" w:after="60"/>
-            </w:pPr>
-            <w:r>
-              <w:rPr>
-                <w:color w:val="374151"/>
-                <w:sz w:val="20"/>
-              </w:rPr>
-              <w:t>ArrowRight / ArrowDown</w:t>
-            </w:r>
-          </w:p>
-        </w:tc>
-        <w:tc>
-          <w:tcPr>
+            <w:tcW w:w="0" w:type="auto"/>
+            <w:shd w:val="clear" w:color="auto" w:fill="FFFFFF"/>
+          </w:tcPr>
+          <w:p>
+            <w:pPr>
+              <w:spacing w:before="60" w:after="60"/>
+            </w:pPr>
+            <w:r>
+              <w:rPr>
+                <w:color w:val="374151"/>
+                <w:sz w:val="20"/>
+              </w:rPr>
+              <w:t xml:space="preserve">Theme </w:t>
+            </w:r>
+            <w:proofErr w:type="spellStart"/>
+            <w:r>
+              <w:rPr>
+                <w:color w:val="374151"/>
+                <w:sz w:val="20"/>
+              </w:rPr>
+              <w:t>Radiogroup</w:t>
+            </w:r>
+            <w:proofErr w:type="spellEnd"/>
+          </w:p>
+        </w:tc>
+        <w:tc>
+          <w:tcPr>
+            <w:tcW w:w="0" w:type="auto"/>
+            <w:shd w:val="clear" w:color="auto" w:fill="FFFFFF"/>
+          </w:tcPr>
+          <w:p>
+            <w:pPr>
+              <w:spacing w:before="60" w:after="60"/>
+            </w:pPr>
+            <w:proofErr w:type="spellStart"/>
+            <w:r>
+              <w:rPr>
+                <w:color w:val="374151"/>
+                <w:sz w:val="20"/>
+              </w:rPr>
+              <w:t>ArrowRight</w:t>
+            </w:r>
+            <w:proofErr w:type="spellEnd"/>
+            <w:r>
+              <w:rPr>
+                <w:color w:val="374151"/>
+                <w:sz w:val="20"/>
+              </w:rPr>
+              <w:t xml:space="preserve"> / </w:t>
+            </w:r>
+            <w:proofErr w:type="spellStart"/>
+            <w:r>
+              <w:rPr>
+                <w:color w:val="374151"/>
+                <w:sz w:val="20"/>
+              </w:rPr>
+              <w:t>ArrowDown</w:t>
+            </w:r>
+            <w:proofErr w:type="spellEnd"/>
+          </w:p>
+        </w:tc>
+        <w:tc>
+          <w:tcPr>
+            <w:tcW w:w="0" w:type="auto"/>
             <w:shd w:val="clear" w:color="auto" w:fill="FFFFFF"/>
           </w:tcPr>
           <w:p>
@@ -1884,6 +2375,7 @@
         </w:tc>
         <w:tc>
           <w:tcPr>
+            <w:tcW w:w="0" w:type="auto"/>
             <w:shd w:val="clear" w:color="auto" w:fill="FFFFFF"/>
           </w:tcPr>
           <w:p>
@@ -1903,6 +2395,7 @@
       <w:tr>
         <w:tc>
           <w:tcPr>
+            <w:tcW w:w="0" w:type="auto"/>
             <w:shd w:val="clear" w:color="auto" w:fill="F9FAFB"/>
           </w:tcPr>
           <w:p>
@@ -1914,29 +2407,58 @@
                 <w:color w:val="374151"/>
                 <w:sz w:val="20"/>
               </w:rPr>
-              <w:t>Theme Radiogroup</w:t>
-            </w:r>
-          </w:p>
-        </w:tc>
-        <w:tc>
-          <w:tcPr>
+              <w:t xml:space="preserve">Theme </w:t>
+            </w:r>
+            <w:proofErr w:type="spellStart"/>
+            <w:r>
+              <w:rPr>
+                <w:color w:val="374151"/>
+                <w:sz w:val="20"/>
+              </w:rPr>
+              <w:t>Radiogroup</w:t>
+            </w:r>
+            <w:proofErr w:type="spellEnd"/>
+          </w:p>
+        </w:tc>
+        <w:tc>
+          <w:tcPr>
+            <w:tcW w:w="0" w:type="auto"/>
             <w:shd w:val="clear" w:color="auto" w:fill="F9FAFB"/>
           </w:tcPr>
           <w:p>
             <w:pPr>
               <w:spacing w:before="60" w:after="60"/>
             </w:pPr>
-            <w:r>
-              <w:rPr>
-                <w:color w:val="374151"/>
-                <w:sz w:val="20"/>
-              </w:rPr>
-              <w:t>ArrowLeft / ArrowUp</w:t>
-            </w:r>
-          </w:p>
-        </w:tc>
-        <w:tc>
-          <w:tcPr>
+            <w:proofErr w:type="spellStart"/>
+            <w:r>
+              <w:rPr>
+                <w:color w:val="374151"/>
+                <w:sz w:val="20"/>
+              </w:rPr>
+              <w:t>ArrowLeft</w:t>
+            </w:r>
+            <w:proofErr w:type="spellEnd"/>
+            <w:r>
+              <w:rPr>
+                <w:color w:val="374151"/>
+                <w:sz w:val="20"/>
+              </w:rPr>
+              <w:t xml:space="preserve"> / </w:t>
+            </w:r>
+            <w:proofErr w:type="spellStart"/>
+            <w:r>
+              <w:rPr>
+                <w:color w:val="374151"/>
+                <w:sz w:val="20"/>
+              </w:rPr>
+              <w:t>ArrowUp</w:t>
+            </w:r>
+            <w:proofErr w:type="spellEnd"/>
+          </w:p>
+        </w:tc>
+        <w:tc>
+          <w:tcPr>
+            <w:tcW w:w="0" w:type="auto"/>
             <w:shd w:val="clear" w:color="auto" w:fill="F9FAFB"/>
           </w:tcPr>
           <w:p>
@@ -1954,6 +2476,7 @@
         </w:tc>
         <w:tc>
           <w:tcPr>
+            <w:tcW w:w="0" w:type="auto"/>
             <w:shd w:val="clear" w:color="auto" w:fill="F9FAFB"/>
           </w:tcPr>
           <w:p>
@@ -1973,6 +2496,7 @@
       <w:tr>
         <w:tc>
           <w:tcPr>
+            <w:tcW w:w="0" w:type="auto"/>
             <w:shd w:val="clear" w:color="auto" w:fill="FFFFFF"/>
           </w:tcPr>
           <w:p>
@@ -1990,6 +2514,7 @@
         </w:tc>
         <w:tc>
           <w:tcPr>
+            <w:tcW w:w="0" w:type="auto"/>
             <w:shd w:val="clear" w:color="auto" w:fill="FFFFFF"/>
           </w:tcPr>
           <w:p>
@@ -2007,6 +2532,7 @@
         </w:tc>
         <w:tc>
           <w:tcPr>
+            <w:tcW w:w="0" w:type="auto"/>
             <w:shd w:val="clear" w:color="auto" w:fill="FFFFFF"/>
           </w:tcPr>
           <w:p>
@@ -2024,6 +2550,7 @@
         </w:tc>
         <w:tc>
           <w:tcPr>
+            <w:tcW w:w="0" w:type="auto"/>
             <w:shd w:val="clear" w:color="auto" w:fill="FFFFFF"/>
           </w:tcPr>
           <w:p>
@@ -2043,6 +2570,7 @@
       <w:tr>
         <w:tc>
           <w:tcPr>
+            <w:tcW w:w="0" w:type="auto"/>
             <w:shd w:val="clear" w:color="auto" w:fill="F9FAFB"/>
           </w:tcPr>
           <w:p>
@@ -2060,6 +2588,7 @@
         </w:tc>
         <w:tc>
           <w:tcPr>
+            <w:tcW w:w="0" w:type="auto"/>
             <w:shd w:val="clear" w:color="auto" w:fill="F9FAFB"/>
           </w:tcPr>
           <w:p>
@@ -2077,6 +2606,7 @@
         </w:tc>
         <w:tc>
           <w:tcPr>
+            <w:tcW w:w="0" w:type="auto"/>
             <w:shd w:val="clear" w:color="auto" w:fill="F9FAFB"/>
           </w:tcPr>
           <w:p>
@@ -2094,6 +2624,7 @@
         </w:tc>
         <w:tc>
           <w:tcPr>
+            <w:tcW w:w="0" w:type="auto"/>
             <w:shd w:val="clear" w:color="auto" w:fill="F9FAFB"/>
           </w:tcPr>
           <w:p>
@@ -2105,7 +2636,23 @@
                 <w:color w:val="374151"/>
                 <w:sz w:val="20"/>
               </w:rPr>
-              <w:t>aria-invalid, aria-describedby, role='status'</w:t>
+              <w:t>aria-invalid, aria-</w:t>
+            </w:r>
+            <w:proofErr w:type="spellStart"/>
+            <w:r>
+              <w:rPr>
+                <w:color w:val="374151"/>
+                <w:sz w:val="20"/>
+              </w:rPr>
+              <w:t>describedby</w:t>
+            </w:r>
+            <w:proofErr w:type="spellEnd"/>
+            <w:r>
+              <w:rPr>
+                <w:color w:val="374151"/>
+                <w:sz w:val="20"/>
+              </w:rPr>
+              <w:t>, role='status'</w:t>
             </w:r>
           </w:p>
         </w:tc>
@@ -2113,6 +2660,7 @@
       <w:tr>
         <w:tc>
           <w:tcPr>
+            <w:tcW w:w="0" w:type="auto"/>
             <w:shd w:val="clear" w:color="auto" w:fill="FFFFFF"/>
           </w:tcPr>
           <w:p>
@@ -2130,6 +2678,7 @@
         </w:tc>
         <w:tc>
           <w:tcPr>
+            <w:tcW w:w="0" w:type="auto"/>
             <w:shd w:val="clear" w:color="auto" w:fill="FFFFFF"/>
           </w:tcPr>
           <w:p>
@@ -2147,6 +2696,7 @@
         </w:tc>
         <w:tc>
           <w:tcPr>
+            <w:tcW w:w="0" w:type="auto"/>
             <w:shd w:val="clear" w:color="auto" w:fill="FFFFFF"/>
           </w:tcPr>
           <w:p>
@@ -2164,36 +2714,40 @@
         </w:tc>
         <w:tc>
           <w:tcPr>
-            <w:shd w:val="clear" w:color="auto" w:fill="FFFFFF"/>
-          </w:tcPr>
-          <w:p>
-            <w:pPr>
-              <w:spacing w:before="60" w:after="60"/>
-            </w:pPr>
-            <w:r>
-              <w:rPr>
-                <w:color w:val="374151"/>
-                <w:sz w:val="20"/>
-              </w:rPr>
-              <w:t>focus() shifted to first invalid node</w:t>
+            <w:tcW w:w="0" w:type="auto"/>
+            <w:shd w:val="clear" w:color="auto" w:fill="FFFFFF"/>
+          </w:tcPr>
+          <w:p>
+            <w:pPr>
+              <w:spacing w:before="60" w:after="60"/>
+            </w:pPr>
+            <w:proofErr w:type="gramStart"/>
+            <w:r>
+              <w:rPr>
+                <w:color w:val="374151"/>
+                <w:sz w:val="20"/>
+              </w:rPr>
+              <w:t>focus(</w:t>
+            </w:r>
+            <w:proofErr w:type="gramEnd"/>
+            <w:r>
+              <w:rPr>
+                <w:color w:val="374151"/>
+                <w:sz w:val="20"/>
+              </w:rPr>
+              <w:t>) shifted to first invalid node</w:t>
             </w:r>
           </w:p>
         </w:tc>
       </w:tr>
     </w:tbl>
-    <w:p>
-      <w:pPr>
-        <w:spacing w:after="160"/>
-      </w:pPr>
-    </w:p>
-    <w:p>
-      <w:pPr>
-        <w:pStyle w:val="Heading1"/>
+    <w:p/>
+    <w:p>
+      <w:pPr>
         <w:spacing w:before="280" w:after="120"/>
       </w:pPr>
       <w:r>
         <w:rPr>
-          <w:rFonts w:ascii="Calibri" w:hAnsi="Calibri"/>
           <w:b/>
           <w:color w:val="1E3A8A"/>
           <w:sz w:val="32"/>
@@ -2207,11 +2761,23 @@
       </w:pPr>
       <w:r>
         <w:rPr>
-          <w:rFonts w:ascii="Calibri" w:hAnsi="Calibri"/>
           <w:color w:val="374151"/>
-          <w:sz w:val="22"/>
-        </w:rPr>
-        <w:t>Form validation incorporates real-time and submission-time evaluation. When a user tabs out of an input with invalid data, the JavaScript controller attaches an aria-invalid='true' attribute and injects an actionable error string into a dedicated &lt;span class='field-error'&gt;. This span is bound to the input via aria-describedby. Assistive technologies immediately announce both the field name and the specific correction instructions upon receiving focus.</w:t>
+        </w:rPr>
+        <w:t>Form validation incorporates real-time and submission-time evaluation. When a user tabs out of an input with invalid data, the JavaScript controller attaches an aria-invalid='true' attribute and injects an actionable error string into a dedicated &lt;span class='field-error'&gt;. This span is bound to the input via aria-</w:t>
+      </w:r>
+      <w:proofErr w:type="spellStart"/>
+      <w:r>
+        <w:rPr>
+          <w:color w:val="374151"/>
+        </w:rPr>
+        <w:t>describedby</w:t>
+      </w:r>
+      <w:proofErr w:type="spellEnd"/>
+      <w:r>
+        <w:rPr>
+          <w:color w:val="374151"/>
+        </w:rPr>
+        <w:t>. Assistive technologies immediately announce both the field name and the specific correction instructions upon receiving focus.</w:t>
       </w:r>
     </w:p>
     <w:p>
@@ -2220,25 +2786,32 @@
       </w:pPr>
       <w:r>
         <w:rPr>
-          <w:rFonts w:ascii="Calibri" w:hAnsi="Calibri"/>
           <w:color w:val="374151"/>
-          <w:sz w:val="22"/>
         </w:rPr>
         <w:t>Furthermore, an aria-live='polite' region (&lt;div id='form-status-message' role='status'&gt;) is positioned below the submit action. Upon successful submission or submission rejection, the live region is populated with status messages, allowing screen reader users to receive immediate confirmation without requiring page reloads.</w:t>
       </w:r>
     </w:p>
     <w:p>
       <w:pPr>
-        <w:pStyle w:val="Heading1"/>
         <w:spacing w:before="280" w:after="120"/>
-      </w:pPr>
-      <w:r>
-        <w:rPr>
-          <w:rFonts w:ascii="Calibri" w:hAnsi="Calibri"/>
+        <w:rPr>
           <w:b/>
           <w:color w:val="1E3A8A"/>
           <w:sz w:val="32"/>
         </w:rPr>
+      </w:pPr>
+    </w:p>
+    <w:p>
+      <w:pPr>
+        <w:spacing w:before="280" w:after="120"/>
+      </w:pPr>
+      <w:r>
+        <w:rPr>
+          <w:b/>
+          <w:color w:val="1E3A8A"/>
+          <w:sz w:val="32"/>
+        </w:rPr>
+        <w:lastRenderedPageBreak/>
         <w:t>7. Audit Results &amp; Verification</w:t>
       </w:r>
     </w:p>
@@ -2248,23 +2821,34 @@
       </w:pPr>
       <w:r>
         <w:rPr>
-          <w:rFonts w:ascii="Calibri" w:hAnsi="Calibri"/>
           <w:color w:val="374151"/>
-          <w:sz w:val="22"/>
-        </w:rPr>
-        <w:t>The TechPulse Insight platform was audited using Google Chrome Lighthouse, axe-core, WAVE Web Accessibility Evaluation Tool, and manual screen reader testing (NVDA on Windows). The platform achieved:</w:t>
-      </w:r>
-    </w:p>
-    <w:p>
-      <w:pPr>
-        <w:pStyle w:val="ListParagraph"/>
+        </w:rPr>
+        <w:t xml:space="preserve">The </w:t>
+      </w:r>
+      <w:proofErr w:type="spellStart"/>
+      <w:r>
+        <w:rPr>
+          <w:color w:val="374151"/>
+        </w:rPr>
+        <w:t>TechPulse</w:t>
+      </w:r>
+      <w:proofErr w:type="spellEnd"/>
+      <w:r>
+        <w:rPr>
+          <w:color w:val="374151"/>
+        </w:rPr>
+        <w:t xml:space="preserve"> Insight platform was audited using Google Chrome Lighthouse, axe-core, WAVE Web Accessibility Evaluation Tool, and manual screen reader testing (NVDA on Windows). The platform achieved:</w:t>
+      </w:r>
+    </w:p>
+    <w:p>
+      <w:pPr>
         <w:spacing w:after="80"/>
         <w:ind w:left="360"/>
       </w:pPr>
       <w:r>
         <w:rPr>
+          <w:b/>
           <w:color w:val="2563EB"/>
-          <w:b/>
         </w:rPr>
         <w:t xml:space="preserve">•  </w:t>
       </w:r>
@@ -2272,29 +2856,25 @@
         <w:rPr>
           <w:b/>
           <w:color w:val="1F2937"/>
-          <w:sz w:val="22"/>
         </w:rPr>
         <w:t xml:space="preserve">Lighthouse Accessibility Score: </w:t>
       </w:r>
       <w:r>
         <w:rPr>
-          <w:rFonts w:ascii="Calibri" w:hAnsi="Calibri"/>
           <w:color w:val="4B5563"/>
-          <w:sz w:val="22"/>
         </w:rPr>
         <w:t>100 / 100 perfect score across all accessibility auditing audits.</w:t>
       </w:r>
     </w:p>
     <w:p>
       <w:pPr>
-        <w:pStyle w:val="ListParagraph"/>
         <w:spacing w:after="80"/>
         <w:ind w:left="360"/>
       </w:pPr>
       <w:r>
         <w:rPr>
+          <w:b/>
           <w:color w:val="2563EB"/>
-          <w:b/>
         </w:rPr>
         <w:t xml:space="preserve">•  </w:t>
       </w:r>
@@ -2302,29 +2882,25 @@
         <w:rPr>
           <w:b/>
           <w:color w:val="1F2937"/>
-          <w:sz w:val="22"/>
         </w:rPr>
         <w:t xml:space="preserve">axe-core Automated Audit: </w:t>
       </w:r>
       <w:r>
         <w:rPr>
-          <w:rFonts w:ascii="Calibri" w:hAnsi="Calibri"/>
           <w:color w:val="4B5563"/>
-          <w:sz w:val="22"/>
         </w:rPr>
         <w:t>0 violations or warnings detected across all theme modes.</w:t>
       </w:r>
     </w:p>
     <w:p>
       <w:pPr>
-        <w:pStyle w:val="ListParagraph"/>
         <w:spacing w:after="80"/>
         <w:ind w:left="360"/>
       </w:pPr>
       <w:r>
         <w:rPr>
+          <w:b/>
           <w:color w:val="2563EB"/>
-          <w:b/>
         </w:rPr>
         <w:t xml:space="preserve">•  </w:t>
       </w:r>
@@ -2332,29 +2908,25 @@
         <w:rPr>
           <w:b/>
           <w:color w:val="1F2937"/>
-          <w:sz w:val="22"/>
         </w:rPr>
         <w:t xml:space="preserve">WAVE Evaluation Tool: </w:t>
       </w:r>
       <w:r>
         <w:rPr>
-          <w:rFonts w:ascii="Calibri" w:hAnsi="Calibri"/>
           <w:color w:val="4B5563"/>
-          <w:sz w:val="22"/>
         </w:rPr>
         <w:t>0 structural errors or contrast alerts detected.</w:t>
       </w:r>
     </w:p>
     <w:p>
       <w:pPr>
-        <w:pStyle w:val="ListParagraph"/>
         <w:spacing w:after="80"/>
         <w:ind w:left="360"/>
       </w:pPr>
       <w:r>
         <w:rPr>
+          <w:b/>
           <w:color w:val="2563EB"/>
-          <w:b/>
         </w:rPr>
         <w:t xml:space="preserve">•  </w:t>
       </w:r>
@@ -2362,15 +2934,12 @@
         <w:rPr>
           <w:b/>
           <w:color w:val="1F2937"/>
-          <w:sz w:val="22"/>
         </w:rPr>
         <w:t xml:space="preserve">Manual Keyboard Audit: </w:t>
       </w:r>
       <w:r>
         <w:rPr>
-          <w:rFonts w:ascii="Calibri" w:hAnsi="Calibri"/>
           <w:color w:val="4B5563"/>
-          <w:sz w:val="22"/>
         </w:rPr>
         <w:t>100% of user flows navigable without mouse interaction.</w:t>
       </w:r>
@@ -2378,22 +2947,755 @@
     <w:sectPr>
       <w:pgSz w:w="12240" w:h="15840"/>
       <w:pgMar w:top="1440" w:right="1440" w:bottom="1440" w:left="1440" w:header="720" w:footer="720" w:gutter="0"/>
+      <w:cols w:space="720"/>
     </w:sectPr>
   </w:body>
 </w:document>
 </file>
 
 <file path=word/styles.xml><?xml version="1.0" encoding="utf-8"?>
-<w:styles xmlns:w="http://schemas.openxmlformats.org/wordprocessingml/2006/main">
+<w:styles xmlns:mc="http://schemas.openxmlformats.org/markup-compatibility/2006" xmlns:r="http://schemas.openxmlformats.org/officeDocument/2006/relationships" xmlns:w="http://schemas.openxmlformats.org/wordprocessingml/2006/main" xmlns:w14="http://schemas.microsoft.com/office/word/2010/wordml" xmlns:w15="http://schemas.microsoft.com/office/word/2012/wordml" xmlns:w16cex="http://schemas.microsoft.com/office/word/2018/wordml/cex" xmlns:w16cid="http://schemas.microsoft.com/office/word/2016/wordml/cid" xmlns:w16="http://schemas.microsoft.com/office/word/2018/wordml" xmlns:w16du="http://schemas.microsoft.com/office/word/2023/wordml/word16du" xmlns:w16sdtdh="http://schemas.microsoft.com/office/word/2020/wordml/sdtdatahash" xmlns:w16sdtfl="http://schemas.microsoft.com/office/word/2024/wordml/sdtformatlock" xmlns:w16se="http://schemas.microsoft.com/office/word/2015/wordml/symex" mc:Ignorable="w14 w15 w16se w16cid w16 w16cex w16sdtdh w16sdtfl w16du">
   <w:docDefaults>
     <w:rPrDefault>
       <w:rPr>
-        <w:rFonts w:ascii="Calibri" w:hAnsi="Calibri" w:cs="Calibri"/>
+        <w:rFonts w:ascii="Calibri" w:eastAsia="Times New Roman" w:hAnsi="Calibri" w:cs="Calibri"/>
         <w:sz w:val="22"/>
         <w:szCs w:val="22"/>
-        <w:lang w:val="en-US"/>
+        <w:lang w:val="en-US" w:eastAsia="en-US" w:bidi="hi-IN"/>
       </w:rPr>
     </w:rPrDefault>
+    <w:pPrDefault>
+      <w:pPr>
+        <w:spacing w:after="160" w:line="278" w:lineRule="auto"/>
+      </w:pPr>
+    </w:pPrDefault>
   </w:docDefaults>
+  <w:latentStyles w:defLockedState="0" w:defUIPriority="99" w:defSemiHidden="0" w:defUnhideWhenUsed="0" w:defQFormat="0" w:count="376">
+    <w:lsdException w:name="Normal" w:uiPriority="0" w:qFormat="1"/>
+    <w:lsdException w:name="heading 1" w:uiPriority="9" w:qFormat="1"/>
+    <w:lsdException w:name="heading 2" w:semiHidden="1" w:uiPriority="9" w:unhideWhenUsed="1" w:qFormat="1"/>
+    <w:lsdException w:name="heading 3" w:semiHidden="1" w:uiPriority="9" w:unhideWhenUsed="1" w:qFormat="1"/>
+    <w:lsdException w:name="heading 4" w:semiHidden="1" w:uiPriority="9" w:unhideWhenUsed="1" w:qFormat="1"/>
+    <w:lsdException w:name="heading 5" w:semiHidden="1" w:uiPriority="9" w:unhideWhenUsed="1" w:qFormat="1"/>
+    <w:lsdException w:name="heading 6" w:semiHidden="1" w:uiPriority="9" w:unhideWhenUsed="1" w:qFormat="1"/>
+    <w:lsdException w:name="heading 7" w:semiHidden="1" w:uiPriority="9" w:unhideWhenUsed="1" w:qFormat="1"/>
+    <w:lsdException w:name="heading 8" w:semiHidden="1" w:uiPriority="9" w:unhideWhenUsed="1" w:qFormat="1"/>
+    <w:lsdException w:name="heading 9" w:semiHidden="1" w:uiPriority="9" w:unhideWhenUsed="1" w:qFormat="1"/>
+    <w:lsdException w:name="index 1" w:semiHidden="1" w:unhideWhenUsed="1"/>
+    <w:lsdException w:name="index 2" w:semiHidden="1" w:unhideWhenUsed="1"/>
+    <w:lsdException w:name="index 3" w:semiHidden="1" w:unhideWhenUsed="1"/>
+    <w:lsdException w:name="index 4" w:semiHidden="1" w:unhideWhenUsed="1"/>
+    <w:lsdException w:name="index 5" w:semiHidden="1" w:unhideWhenUsed="1"/>
+    <w:lsdException w:name="index 6" w:semiHidden="1" w:unhideWhenUsed="1"/>
+    <w:lsdException w:name="index 7" w:semiHidden="1" w:unhideWhenUsed="1"/>
+    <w:lsdException w:name="index 8" w:semiHidden="1" w:unhideWhenUsed="1"/>
+    <w:lsdException w:name="index 9" w:semiHidden="1" w:unhideWhenUsed="1"/>
+    <w:lsdException w:name="toc 1" w:semiHidden="1" w:uiPriority="39" w:unhideWhenUsed="1"/>
+    <w:lsdException w:name="toc 2" w:semiHidden="1" w:uiPriority="39" w:unhideWhenUsed="1"/>
+    <w:lsdException w:name="toc 3" w:semiHidden="1" w:uiPriority="39" w:unhideWhenUsed="1"/>
+    <w:lsdException w:name="toc 4" w:semiHidden="1" w:uiPriority="39" w:unhideWhenUsed="1"/>
+    <w:lsdException w:name="toc 5" w:semiHidden="1" w:uiPriority="39" w:unhideWhenUsed="1"/>
+    <w:lsdException w:name="toc 6" w:semiHidden="1" w:uiPriority="39" w:unhideWhenUsed="1"/>
+    <w:lsdException w:name="toc 7" w:semiHidden="1" w:uiPriority="39" w:unhideWhenUsed="1"/>
+    <w:lsdException w:name="toc 8" w:semiHidden="1" w:uiPriority="39" w:unhideWhenUsed="1"/>
+    <w:lsdException w:name="toc 9" w:semiHidden="1" w:uiPriority="39" w:unhideWhenUsed="1"/>
+    <w:lsdException w:name="Normal Indent" w:semiHidden="1" w:unhideWhenUsed="1"/>
+    <w:lsdException w:name="footnote text" w:semiHidden="1" w:unhideWhenUsed="1"/>
+    <w:lsdException w:name="annotation text" w:semiHidden="1" w:unhideWhenUsed="1"/>
+    <w:lsdException w:name="header" w:semiHidden="1" w:unhideWhenUsed="1"/>
+    <w:lsdException w:name="footer" w:semiHidden="1" w:unhideWhenUsed="1"/>
+    <w:lsdException w:name="index heading" w:semiHidden="1" w:unhideWhenUsed="1"/>
+    <w:lsdException w:name="caption" w:semiHidden="1" w:uiPriority="35" w:unhideWhenUsed="1" w:qFormat="1"/>
+    <w:lsdException w:name="table of figures" w:semiHidden="1" w:unhideWhenUsed="1"/>
+    <w:lsdException w:name="envelope address" w:semiHidden="1" w:unhideWhenUsed="1"/>
+    <w:lsdException w:name="envelope return" w:semiHidden="1" w:unhideWhenUsed="1"/>
+    <w:lsdException w:name="footnote reference" w:semiHidden="1" w:unhideWhenUsed="1"/>
+    <w:lsdException w:name="annotation reference" w:semiHidden="1" w:unhideWhenUsed="1"/>
+    <w:lsdException w:name="line number" w:semiHidden="1" w:unhideWhenUsed="1"/>
+    <w:lsdException w:name="page number" w:semiHidden="1" w:unhideWhenUsed="1"/>
+    <w:lsdException w:name="endnote reference" w:semiHidden="1" w:unhideWhenUsed="1"/>
+    <w:lsdException w:name="endnote text" w:semiHidden="1" w:unhideWhenUsed="1"/>
+    <w:lsdException w:name="table of authorities" w:semiHidden="1" w:unhideWhenUsed="1"/>
+    <w:lsdException w:name="macro" w:semiHidden="1" w:unhideWhenUsed="1"/>
+    <w:lsdException w:name="toa heading" w:semiHidden="1" w:unhideWhenUsed="1"/>
+    <w:lsdException w:name="List" w:semiHidden="1" w:unhideWhenUsed="1"/>
+    <w:lsdException w:name="List Bullet" w:semiHidden="1" w:unhideWhenUsed="1"/>
+    <w:lsdException w:name="List Number" w:semiHidden="1" w:unhideWhenUsed="1"/>
+    <w:lsdException w:name="List 2" w:semiHidden="1" w:unhideWhenUsed="1"/>
+    <w:lsdException w:name="List 3" w:semiHidden="1" w:unhideWhenUsed="1"/>
+    <w:lsdException w:name="List 4" w:semiHidden="1" w:unhideWhenUsed="1"/>
+    <w:lsdException w:name="List 5" w:semiHidden="1" w:unhideWhenUsed="1"/>
+    <w:lsdException w:name="List Bullet 2" w:semiHidden="1" w:unhideWhenUsed="1"/>
+    <w:lsdException w:name="List Bullet 3" w:semiHidden="1" w:unhideWhenUsed="1"/>
+    <w:lsdException w:name="List Bullet 4" w:semiHidden="1" w:unhideWhenUsed="1"/>
+    <w:lsdException w:name="List Bullet 5" w:semiHidden="1" w:unhideWhenUsed="1"/>
+    <w:lsdException w:name="List Number 2" w:semiHidden="1" w:unhideWhenUsed="1"/>
+    <w:lsdException w:name="List Number 3" w:semiHidden="1" w:unhideWhenUsed="1"/>
+    <w:lsdException w:name="List Number 4" w:semiHidden="1" w:unhideWhenUsed="1"/>
+    <w:lsdException w:name="List Number 5" w:semiHidden="1" w:unhideWhenUsed="1"/>
+    <w:lsdException w:name="Title" w:uiPriority="10" w:qFormat="1"/>
+    <w:lsdException w:name="Closing" w:semiHidden="1" w:unhideWhenUsed="1"/>
+    <w:lsdException w:name="Signature" w:semiHidden="1" w:unhideWhenUsed="1"/>
+    <w:lsdException w:name="Default Paragraph Font" w:semiHidden="1" w:uiPriority="1" w:unhideWhenUsed="1"/>
+    <w:lsdException w:name="Body Text" w:semiHidden="1" w:unhideWhenUsed="1"/>
+    <w:lsdException w:name="Body Text Indent" w:semiHidden="1" w:unhideWhenUsed="1"/>
+    <w:lsdException w:name="List Continue" w:semiHidden="1" w:unhideWhenUsed="1"/>
+    <w:lsdException w:name="List Continue 2" w:semiHidden="1" w:unhideWhenUsed="1"/>
+    <w:lsdException w:name="List Continue 3" w:semiHidden="1" w:unhideWhenUsed="1"/>
+    <w:lsdException w:name="List Continue 4" w:semiHidden="1" w:unhideWhenUsed="1"/>
+    <w:lsdException w:name="List Continue 5" w:semiHidden="1" w:unhideWhenUsed="1"/>
+    <w:lsdException w:name="Message Header" w:semiHidden="1" w:unhideWhenUsed="1"/>
+    <w:lsdException w:name="Subtitle" w:uiPriority="11" w:qFormat="1"/>
+    <w:lsdException w:name="Salutation" w:semiHidden="1" w:unhideWhenUsed="1"/>
+    <w:lsdException w:name="Date" w:semiHidden="1" w:unhideWhenUsed="1"/>
+    <w:lsdException w:name="Body Text First Indent" w:semiHidden="1" w:unhideWhenUsed="1"/>
+    <w:lsdException w:name="Body Text First Indent 2" w:semiHidden="1" w:unhideWhenUsed="1"/>
+    <w:lsdException w:name="Note Heading" w:semiHidden="1" w:unhideWhenUsed="1"/>
+    <w:lsdException w:name="Body Text 2" w:semiHidden="1" w:unhideWhenUsed="1"/>
+    <w:lsdException w:name="Body Text 3" w:semiHidden="1" w:unhideWhenUsed="1"/>
+    <w:lsdException w:name="Body Text Indent 2" w:semiHidden="1" w:unhideWhenUsed="1"/>
+    <w:lsdException w:name="Body Text Indent 3" w:semiHidden="1" w:unhideWhenUsed="1"/>
+    <w:lsdException w:name="Block Text" w:semiHidden="1" w:unhideWhenUsed="1"/>
+    <w:lsdException w:name="Hyperlink" w:semiHidden="1" w:unhideWhenUsed="1"/>
+    <w:lsdException w:name="FollowedHyperlink" w:semiHidden="1" w:unhideWhenUsed="1"/>
+    <w:lsdException w:name="Strong" w:uiPriority="22" w:qFormat="1"/>
+    <w:lsdException w:name="Emphasis" w:uiPriority="20" w:qFormat="1"/>
+    <w:lsdException w:name="Document Map" w:semiHidden="1" w:unhideWhenUsed="1"/>
+    <w:lsdException w:name="Plain Text" w:semiHidden="1" w:unhideWhenUsed="1"/>
+    <w:lsdException w:name="E-mail Signature" w:semiHidden="1" w:unhideWhenUsed="1"/>
+    <w:lsdException w:name="HTML Top of Form" w:semiHidden="1" w:unhideWhenUsed="1"/>
+    <w:lsdException w:name="HTML Bottom of Form" w:semiHidden="1" w:unhideWhenUsed="1"/>
+    <w:lsdException w:name="Normal (Web)" w:semiHidden="1" w:unhideWhenUsed="1"/>
+    <w:lsdException w:name="HTML Acronym" w:semiHidden="1" w:unhideWhenUsed="1"/>
+    <w:lsdException w:name="HTML Address" w:semiHidden="1" w:unhideWhenUsed="1"/>
+    <w:lsdException w:name="HTML Cite" w:semiHidden="1" w:unhideWhenUsed="1"/>
+    <w:lsdException w:name="HTML Code" w:semiHidden="1" w:unhideWhenUsed="1"/>
+    <w:lsdException w:name="HTML Definition" w:semiHidden="1" w:unhideWhenUsed="1"/>
+    <w:lsdException w:name="HTML Keyboard" w:semiHidden="1" w:unhideWhenUsed="1"/>
+    <w:lsdException w:name="HTML Preformatted" w:semiHidden="1" w:unhideWhenUsed="1"/>
+    <w:lsdException w:name="HTML Sample" w:semiHidden="1" w:unhideWhenUsed="1"/>
+    <w:lsdException w:name="HTML Typewriter" w:semiHidden="1" w:unhideWhenUsed="1"/>
+    <w:lsdException w:name="HTML Variable" w:semiHidden="1" w:unhideWhenUsed="1"/>
+    <w:lsdException w:name="Normal Table" w:semiHidden="1" w:unhideWhenUsed="1"/>
+    <w:lsdException w:name="annotation subject" w:semiHidden="1" w:unhideWhenUsed="1"/>
+    <w:lsdException w:name="No List" w:semiHidden="1" w:unhideWhenUsed="1"/>
+    <w:lsdException w:name="Outline List 1" w:semiHidden="1" w:unhideWhenUsed="1"/>
+    <w:lsdException w:name="Outline List 2" w:semiHidden="1" w:unhideWhenUsed="1"/>
+    <w:lsdException w:name="Outline List 3" w:semiHidden="1" w:unhideWhenUsed="1"/>
+    <w:lsdException w:name="Table Simple 1" w:semiHidden="1" w:unhideWhenUsed="1"/>
+    <w:lsdException w:name="Table Simple 2" w:semiHidden="1" w:unhideWhenUsed="1"/>
+    <w:lsdException w:name="Table Simple 3" w:semiHidden="1" w:unhideWhenUsed="1"/>
+    <w:lsdException w:name="Table Classic 1" w:semiHidden="1" w:unhideWhenUsed="1"/>
+    <w:lsdException w:name="Table Classic 2" w:semiHidden="1" w:unhideWhenUsed="1"/>
+    <w:lsdException w:name="Table Classic 3" w:semiHidden="1" w:unhideWhenUsed="1"/>
+    <w:lsdException w:name="Table Classic 4" w:semiHidden="1" w:unhideWhenUsed="1"/>
+    <w:lsdException w:name="Table Colorful 1" w:semiHidden="1" w:unhideWhenUsed="1"/>
+    <w:lsdException w:name="Table Colorful 2" w:semiHidden="1" w:unhideWhenUsed="1"/>
+    <w:lsdException w:name="Table Colorful 3" w:semiHidden="1" w:unhideWhenUsed="1"/>
+    <w:lsdException w:name="Table Columns 1" w:semiHidden="1" w:unhideWhenUsed="1"/>
+    <w:lsdException w:name="Table Columns 2" w:semiHidden="1" w:unhideWhenUsed="1"/>
+    <w:lsdException w:name="Table Columns 3" w:semiHidden="1" w:unhideWhenUsed="1"/>
+    <w:lsdException w:name="Table Columns 4" w:semiHidden="1" w:unhideWhenUsed="1"/>
+    <w:lsdException w:name="Table Columns 5" w:semiHidden="1" w:unhideWhenUsed="1"/>
+    <w:lsdException w:name="Table Grid 1" w:semiHidden="1" w:unhideWhenUsed="1"/>
+    <w:lsdException w:name="Table Grid 2" w:semiHidden="1" w:unhideWhenUsed="1"/>
+    <w:lsdException w:name="Table Grid 3" w:semiHidden="1" w:unhideWhenUsed="1"/>
+    <w:lsdException w:name="Table Grid 4" w:semiHidden="1" w:unhideWhenUsed="1"/>
+    <w:lsdException w:name="Table Grid 5" w:semiHidden="1" w:unhideWhenUsed="1"/>
+    <w:lsdException w:name="Table Grid 6" w:semiHidden="1" w:unhideWhenUsed="1"/>
+    <w:lsdException w:name="Table Grid 7" w:semiHidden="1" w:unhideWhenUsed="1"/>
+    <w:lsdException w:name="Table Grid 8" w:semiHidden="1" w:unhideWhenUsed="1"/>
+    <w:lsdException w:name="Table List 1" w:semiHidden="1" w:unhideWhenUsed="1"/>
+    <w:lsdException w:name="Table List 2" w:semiHidden="1" w:unhideWhenUsed="1"/>
+    <w:lsdException w:name="Table List 3" w:semiHidden="1" w:unhideWhenUsed="1"/>
+    <w:lsdException w:name="Table List 4" w:semiHidden="1" w:unhideWhenUsed="1"/>
+    <w:lsdException w:name="Table List 5" w:semiHidden="1" w:unhideWhenUsed="1"/>
+    <w:lsdException w:name="Table List 6" w:semiHidden="1" w:unhideWhenUsed="1"/>
+    <w:lsdException w:name="Table List 7" w:semiHidden="1" w:unhideWhenUsed="1"/>
+    <w:lsdException w:name="Table List 8" w:semiHidden="1" w:unhideWhenUsed="1"/>
+    <w:lsdException w:name="Table 3D effects 1" w:semiHidden="1" w:unhideWhenUsed="1"/>
+    <w:lsdException w:name="Table 3D effects 2" w:semiHidden="1" w:unhideWhenUsed="1"/>
+    <w:lsdException w:name="Table 3D effects 3" w:semiHidden="1" w:unhideWhenUsed="1"/>
+    <w:lsdException w:name="Table Contemporary" w:semiHidden="1" w:unhideWhenUsed="1"/>
+    <w:lsdException w:name="Table Elegant" w:semiHidden="1" w:unhideWhenUsed="1"/>
+    <w:lsdException w:name="Table Professional" w:semiHidden="1" w:unhideWhenUsed="1"/>
+    <w:lsdException w:name="Table Subtle 1" w:semiHidden="1" w:unhideWhenUsed="1"/>
+    <w:lsdException w:name="Table Subtle 2" w:semiHidden="1" w:unhideWhenUsed="1"/>
+    <w:lsdException w:name="Table Web 1" w:semiHidden="1" w:unhideWhenUsed="1"/>
+    <w:lsdException w:name="Table Web 2" w:semiHidden="1" w:unhideWhenUsed="1"/>
+    <w:lsdException w:name="Table Web 3" w:semiHidden="1" w:unhideWhenUsed="1"/>
+    <w:lsdException w:name="Balloon Text" w:semiHidden="1" w:unhideWhenUsed="1"/>
+    <w:lsdException w:name="Table Grid" w:uiPriority="39"/>
+    <w:lsdException w:name="Table Theme" w:semiHidden="1" w:unhideWhenUsed="1"/>
+    <w:lsdException w:name="Placeholder Text" w:semiHidden="1"/>
+    <w:lsdException w:name="No Spacing" w:uiPriority="1" w:qFormat="1"/>
+    <w:lsdException w:name="Light Shading" w:uiPriority="60"/>
+    <w:lsdException w:name="Light List" w:uiPriority="61"/>
+    <w:lsdException w:name="Light Grid" w:uiPriority="62"/>
+    <w:lsdException w:name="Medium Shading 1" w:uiPriority="63"/>
+    <w:lsdException w:name="Medium Shading 2" w:uiPriority="64"/>
+    <w:lsdException w:name="Medium List 1" w:uiPriority="65"/>
+    <w:lsdException w:name="Medium List 2" w:uiPriority="66"/>
+    <w:lsdException w:name="Medium Grid 1" w:uiPriority="67"/>
+    <w:lsdException w:name="Medium Grid 2" w:uiPriority="68"/>
+    <w:lsdException w:name="Medium Grid 3" w:uiPriority="69"/>
+    <w:lsdException w:name="Dark List" w:uiPriority="70"/>
+    <w:lsdException w:name="Colorful Shading" w:uiPriority="71"/>
+    <w:lsdException w:name="Colorful List" w:uiPriority="72"/>
+    <w:lsdException w:name="Colorful Grid" w:uiPriority="73"/>
+    <w:lsdException w:name="Light Shading Accent 1" w:uiPriority="60"/>
+    <w:lsdException w:name="Light List Accent 1" w:uiPriority="61"/>
+    <w:lsdException w:name="Light Grid Accent 1" w:uiPriority="62"/>
+    <w:lsdException w:name="Medium Shading 1 Accent 1" w:uiPriority="63"/>
+    <w:lsdException w:name="Medium Shading 2 Accent 1" w:uiPriority="64"/>
+    <w:lsdException w:name="Medium List 1 Accent 1" w:uiPriority="65"/>
+    <w:lsdException w:name="Revision" w:semiHidden="1"/>
+    <w:lsdException w:name="List Paragraph" w:uiPriority="34" w:qFormat="1"/>
+    <w:lsdException w:name="Quote" w:uiPriority="29" w:qFormat="1"/>
+    <w:lsdException w:name="Intense Quote" w:uiPriority="30" w:qFormat="1"/>
+    <w:lsdException w:name="Medium List 2 Accent 1" w:uiPriority="66"/>
+    <w:lsdException w:name="Medium Grid 1 Accent 1" w:uiPriority="67"/>
+    <w:lsdException w:name="Medium Grid 2 Accent 1" w:uiPriority="68"/>
+    <w:lsdException w:name="Medium Grid 3 Accent 1" w:uiPriority="69"/>
+    <w:lsdException w:name="Dark List Accent 1" w:uiPriority="70"/>
+    <w:lsdException w:name="Colorful Shading Accent 1" w:uiPriority="71"/>
+    <w:lsdException w:name="Colorful List Accent 1" w:uiPriority="72"/>
+    <w:lsdException w:name="Colorful Grid Accent 1" w:uiPriority="73"/>
+    <w:lsdException w:name="Light Shading Accent 2" w:uiPriority="60"/>
+    <w:lsdException w:name="Light List Accent 2" w:uiPriority="61"/>
+    <w:lsdException w:name="Light Grid Accent 2" w:uiPriority="62"/>
+    <w:lsdException w:name="Medium Shading 1 Accent 2" w:uiPriority="63"/>
+    <w:lsdException w:name="Medium Shading 2 Accent 2" w:uiPriority="64"/>
+    <w:lsdException w:name="Medium List 1 Accent 2" w:uiPriority="65"/>
+    <w:lsdException w:name="Medium List 2 Accent 2" w:uiPriority="66"/>
+    <w:lsdException w:name="Medium Grid 1 Accent 2" w:uiPriority="67"/>
+    <w:lsdException w:name="Medium Grid 2 Accent 2" w:uiPriority="68"/>
+    <w:lsdException w:name="Medium Grid 3 Accent 2" w:uiPriority="69"/>
+    <w:lsdException w:name="Dark List Accent 2" w:uiPriority="70"/>
+    <w:lsdException w:name="Colorful Shading Accent 2" w:uiPriority="71"/>
+    <w:lsdException w:name="Colorful List Accent 2" w:uiPriority="72"/>
+    <w:lsdException w:name="Colorful Grid Accent 2" w:uiPriority="73"/>
+    <w:lsdException w:name="Light Shading Accent 3" w:uiPriority="60"/>
+    <w:lsdException w:name="Light List Accent 3" w:uiPriority="61"/>
+    <w:lsdException w:name="Light Grid Accent 3" w:uiPriority="62"/>
+    <w:lsdException w:name="Medium Shading 1 Accent 3" w:uiPriority="63"/>
+    <w:lsdException w:name="Medium Shading 2 Accent 3" w:uiPriority="64"/>
+    <w:lsdException w:name="Medium List 1 Accent 3" w:uiPriority="65"/>
+    <w:lsdException w:name="Medium List 2 Accent 3" w:uiPriority="66"/>
+    <w:lsdException w:name="Medium Grid 1 Accent 3" w:uiPriority="67"/>
+    <w:lsdException w:name="Medium Grid 2 Accent 3" w:uiPriority="68"/>
+    <w:lsdException w:name="Medium Grid 3 Accent 3" w:uiPriority="69"/>
+    <w:lsdException w:name="Dark List Accent 3" w:uiPriority="70"/>
+    <w:lsdException w:name="Colorful Shading Accent 3" w:uiPriority="71"/>
+    <w:lsdException w:name="Colorful List Accent 3" w:uiPriority="72"/>
+    <w:lsdException w:name="Colorful Grid Accent 3" w:uiPriority="73"/>
+    <w:lsdException w:name="Light Shading Accent 4" w:uiPriority="60"/>
+    <w:lsdException w:name="Light List Accent 4" w:uiPriority="61"/>
+    <w:lsdException w:name="Light Grid Accent 4" w:uiPriority="62"/>
+    <w:lsdException w:name="Medium Shading 1 Accent 4" w:uiPriority="63"/>
+    <w:lsdException w:name="Medium Shading 2 Accent 4" w:uiPriority="64"/>
+    <w:lsdException w:name="Medium List 1 Accent 4" w:uiPriority="65"/>
+    <w:lsdException w:name="Medium List 2 Accent 4" w:uiPriority="66"/>
+    <w:lsdException w:name="Medium Grid 1 Accent 4" w:uiPriority="67"/>
+    <w:lsdException w:name="Medium Grid 2 Accent 4" w:uiPriority="68"/>
+    <w:lsdException w:name="Medium Grid 3 Accent 4" w:uiPriority="69"/>
+    <w:lsdException w:name="Dark List Accent 4" w:uiPriority="70"/>
+    <w:lsdException w:name="Colorful Shading Accent 4" w:uiPriority="71"/>
+    <w:lsdException w:name="Colorful List Accent 4" w:uiPriority="72"/>
+    <w:lsdException w:name="Colorful Grid Accent 4" w:uiPriority="73"/>
+    <w:lsdException w:name="Light Shading Accent 5" w:uiPriority="60"/>
+    <w:lsdException w:name="Light List Accent 5" w:uiPriority="61"/>
+    <w:lsdException w:name="Light Grid Accent 5" w:uiPriority="62"/>
+    <w:lsdException w:name="Medium Shading 1 Accent 5" w:uiPriority="63"/>
+    <w:lsdException w:name="Medium Shading 2 Accent 5" w:uiPriority="64"/>
+    <w:lsdException w:name="Medium List 1 Accent 5" w:uiPriority="65"/>
+    <w:lsdException w:name="Medium List 2 Accent 5" w:uiPriority="66"/>
+    <w:lsdException w:name="Medium Grid 1 Accent 5" w:uiPriority="67"/>
+    <w:lsdException w:name="Medium Grid 2 Accent 5" w:uiPriority="68"/>
+    <w:lsdException w:name="Medium Grid 3 Accent 5" w:uiPriority="69"/>
+    <w:lsdException w:name="Dark List Accent 5" w:uiPriority="70"/>
+    <w:lsdException w:name="Colorful Shading Accent 5" w:uiPriority="71"/>
+    <w:lsdException w:name="Colorful List Accent 5" w:uiPriority="72"/>
+    <w:lsdException w:name="Colorful Grid Accent 5" w:uiPriority="73"/>
+    <w:lsdException w:name="Light Shading Accent 6" w:uiPriority="60"/>
+    <w:lsdException w:name="Light List Accent 6" w:uiPriority="61"/>
+    <w:lsdException w:name="Light Grid Accent 6" w:uiPriority="62"/>
+    <w:lsdException w:name="Medium Shading 1 Accent 6" w:uiPriority="63"/>
+    <w:lsdException w:name="Medium Shading 2 Accent 6" w:uiPriority="64"/>
+    <w:lsdException w:name="Medium List 1 Accent 6" w:uiPriority="65"/>
+    <w:lsdException w:name="Medium List 2 Accent 6" w:uiPriority="66"/>
+    <w:lsdException w:name="Medium Grid 1 Accent 6" w:uiPriority="67"/>
+    <w:lsdException w:name="Medium Grid 2 Accent 6" w:uiPriority="68"/>
+    <w:lsdException w:name="Medium Grid 3 Accent 6" w:uiPriority="69"/>
+    <w:lsdException w:name="Dark List Accent 6" w:uiPriority="70"/>
+    <w:lsdException w:name="Colorful Shading Accent 6" w:uiPriority="71"/>
+    <w:lsdException w:name="Colorful List Accent 6" w:uiPriority="72"/>
+    <w:lsdException w:name="Colorful Grid Accent 6" w:uiPriority="73"/>
+    <w:lsdException w:name="Subtle Emphasis" w:uiPriority="19" w:qFormat="1"/>
+    <w:lsdException w:name="Intense Emphasis" w:uiPriority="21" w:qFormat="1"/>
+    <w:lsdException w:name="Subtle Reference" w:uiPriority="31" w:qFormat="1"/>
+    <w:lsdException w:name="Intense Reference" w:uiPriority="32" w:qFormat="1"/>
+    <w:lsdException w:name="Book Title" w:uiPriority="33" w:qFormat="1"/>
+    <w:lsdException w:name="Bibliography" w:semiHidden="1" w:uiPriority="37" w:unhideWhenUsed="1"/>
+    <w:lsdException w:name="TOC Heading" w:semiHidden="1" w:uiPriority="39" w:unhideWhenUsed="1" w:qFormat="1"/>
+    <w:lsdException w:name="Plain Table 1" w:uiPriority="41"/>
+    <w:lsdException w:name="Plain Table 2" w:uiPriority="42"/>
+    <w:lsdException w:name="Plain Table 3" w:uiPriority="43"/>
+    <w:lsdException w:name="Plain Table 4" w:uiPriority="44"/>
+    <w:lsdException w:name="Plain Table 5" w:uiPriority="45"/>
+    <w:lsdException w:name="Grid Table Light" w:uiPriority="40"/>
+    <w:lsdException w:name="Grid Table 1 Light" w:uiPriority="46"/>
+    <w:lsdException w:name="Grid Table 2" w:uiPriority="47"/>
+    <w:lsdException w:name="Grid Table 3" w:uiPriority="48"/>
+    <w:lsdException w:name="Grid Table 4" w:uiPriority="49"/>
+    <w:lsdException w:name="Grid Table 5 Dark" w:uiPriority="50"/>
+    <w:lsdException w:name="Grid Table 6 Colorful" w:uiPriority="51"/>
+    <w:lsdException w:name="Grid Table 7 Colorful" w:uiPriority="52"/>
+    <w:lsdException w:name="Grid Table 1 Light Accent 1" w:uiPriority="46"/>
+    <w:lsdException w:name="Grid Table 2 Accent 1" w:uiPriority="47"/>
+    <w:lsdException w:name="Grid Table 3 Accent 1" w:uiPriority="48"/>
+    <w:lsdException w:name="Grid Table 4 Accent 1" w:uiPriority="49"/>
+    <w:lsdException w:name="Grid Table 5 Dark Accent 1" w:uiPriority="50"/>
+    <w:lsdException w:name="Grid Table 6 Colorful Accent 1" w:uiPriority="51"/>
+    <w:lsdException w:name="Grid Table 7 Colorful Accent 1" w:uiPriority="52"/>
+    <w:lsdException w:name="Grid Table 1 Light Accent 2" w:uiPriority="46"/>
+    <w:lsdException w:name="Grid Table 2 Accent 2" w:uiPriority="47"/>
+    <w:lsdException w:name="Grid Table 3 Accent 2" w:uiPriority="48"/>
+    <w:lsdException w:name="Grid Table 4 Accent 2" w:uiPriority="49"/>
+    <w:lsdException w:name="Grid Table 5 Dark Accent 2" w:uiPriority="50"/>
+    <w:lsdException w:name="Grid Table 6 Colorful Accent 2" w:uiPriority="51"/>
+    <w:lsdException w:name="Grid Table 7 Colorful Accent 2" w:uiPriority="52"/>
+    <w:lsdException w:name="Grid Table 1 Light Accent 3" w:uiPriority="46"/>
+    <w:lsdException w:name="Grid Table 2 Accent 3" w:uiPriority="47"/>
+    <w:lsdException w:name="Grid Table 3 Accent 3" w:uiPriority="48"/>
+    <w:lsdException w:name="Grid Table 4 Accent 3" w:uiPriority="49"/>
+    <w:lsdException w:name="Grid Table 5 Dark Accent 3" w:uiPriority="50"/>
+    <w:lsdException w:name="Grid Table 6 Colorful Accent 3" w:uiPriority="51"/>
+    <w:lsdException w:name="Grid Table 7 Colorful Accent 3" w:uiPriority="52"/>
+    <w:lsdException w:name="Grid Table 1 Light Accent 4" w:uiPriority="46"/>
+    <w:lsdException w:name="Grid Table 2 Accent 4" w:uiPriority="47"/>
+    <w:lsdException w:name="Grid Table 3 Accent 4" w:uiPriority="48"/>
+    <w:lsdException w:name="Grid Table 4 Accent 4" w:uiPriority="49"/>
+    <w:lsdException w:name="Grid Table 5 Dark Accent 4" w:uiPriority="50"/>
+    <w:lsdException w:name="Grid Table 6 Colorful Accent 4" w:uiPriority="51"/>
+    <w:lsdException w:name="Grid Table 7 Colorful Accent 4" w:uiPriority="52"/>
+    <w:lsdException w:name="Grid Table 1 Light Accent 5" w:uiPriority="46"/>
+    <w:lsdException w:name="Grid Table 2 Accent 5" w:uiPriority="47"/>
+    <w:lsdException w:name="Grid Table 3 Accent 5" w:uiPriority="48"/>
+    <w:lsdException w:name="Grid Table 4 Accent 5" w:uiPriority="49"/>
+    <w:lsdException w:name="Grid Table 5 Dark Accent 5" w:uiPriority="50"/>
+    <w:lsdException w:name="Grid Table 6 Colorful Accent 5" w:uiPriority="51"/>
+    <w:lsdException w:name="Grid Table 7 Colorful Accent 5" w:uiPriority="52"/>
+    <w:lsdException w:name="Grid Table 1 Light Accent 6" w:uiPriority="46"/>
+    <w:lsdException w:name="Grid Table 2 Accent 6" w:uiPriority="47"/>
+    <w:lsdException w:name="Grid Table 3 Accent 6" w:uiPriority="48"/>
+    <w:lsdException w:name="Grid Table 4 Accent 6" w:uiPriority="49"/>
+    <w:lsdException w:name="Grid Table 5 Dark Accent 6" w:uiPriority="50"/>
+    <w:lsdException w:name="Grid Table 6 Colorful Accent 6" w:uiPriority="51"/>
+    <w:lsdException w:name="Grid Table 7 Colorful Accent 6" w:uiPriority="52"/>
+    <w:lsdException w:name="List Table 1 Light" w:uiPriority="46"/>
+    <w:lsdException w:name="List Table 2" w:uiPriority="47"/>
+    <w:lsdException w:name="List Table 3" w:uiPriority="48"/>
+    <w:lsdException w:name="List Table 4" w:uiPriority="49"/>
+    <w:lsdException w:name="List Table 5 Dark" w:uiPriority="50"/>
+    <w:lsdException w:name="List Table 6 Colorful" w:uiPriority="51"/>
+    <w:lsdException w:name="List Table 7 Colorful" w:uiPriority="52"/>
+    <w:lsdException w:name="List Table 1 Light Accent 1" w:uiPriority="46"/>
+    <w:lsdException w:name="List Table 2 Accent 1" w:uiPriority="47"/>
+    <w:lsdException w:name="List Table 3 Accent 1" w:uiPriority="48"/>
+    <w:lsdException w:name="List Table 4 Accent 1" w:uiPriority="49"/>
+    <w:lsdException w:name="List Table 5 Dark Accent 1" w:uiPriority="50"/>
+    <w:lsdException w:name="List Table 6 Colorful Accent 1" w:uiPriority="51"/>
+    <w:lsdException w:name="List Table 7 Colorful Accent 1" w:uiPriority="52"/>
+    <w:lsdException w:name="List Table 1 Light Accent 2" w:uiPriority="46"/>
+    <w:lsdException w:name="List Table 2 Accent 2" w:uiPriority="47"/>
+    <w:lsdException w:name="List Table 3 Accent 2" w:uiPriority="48"/>
+    <w:lsdException w:name="List Table 4 Accent 2" w:uiPriority="49"/>
+    <w:lsdException w:name="List Table 5 Dark Accent 2" w:uiPriority="50"/>
+    <w:lsdException w:name="List Table 6 Colorful Accent 2" w:uiPriority="51"/>
+    <w:lsdException w:name="List Table 7 Colorful Accent 2" w:uiPriority="52"/>
+    <w:lsdException w:name="List Table 1 Light Accent 3" w:uiPriority="46"/>
+    <w:lsdException w:name="List Table 2 Accent 3" w:uiPriority="47"/>
+    <w:lsdException w:name="List Table 3 Accent 3" w:uiPriority="48"/>
+    <w:lsdException w:name="List Table 4 Accent 3" w:uiPriority="49"/>
+    <w:lsdException w:name="List Table 5 Dark Accent 3" w:uiPriority="50"/>
+    <w:lsdException w:name="List Table 6 Colorful Accent 3" w:uiPriority="51"/>
+    <w:lsdException w:name="List Table 7 Colorful Accent 3" w:uiPriority="52"/>
+    <w:lsdException w:name="List Table 1 Light Accent 4" w:uiPriority="46"/>
+    <w:lsdException w:name="List Table 2 Accent 4" w:uiPriority="47"/>
+    <w:lsdException w:name="List Table 3 Accent 4" w:uiPriority="48"/>
+    <w:lsdException w:name="List Table 4 Accent 4" w:uiPriority="49"/>
+    <w:lsdException w:name="List Table 5 Dark Accent 4" w:uiPriority="50"/>
+    <w:lsdException w:name="List Table 6 Colorful Accent 4" w:uiPriority="51"/>
+    <w:lsdException w:name="List Table 7 Colorful Accent 4" w:uiPriority="52"/>
+    <w:lsdException w:name="List Table 1 Light Accent 5" w:uiPriority="46"/>
+    <w:lsdException w:name="List Table 2 Accent 5" w:uiPriority="47"/>
+    <w:lsdException w:name="List Table 3 Accent 5" w:uiPriority="48"/>
+    <w:lsdException w:name="List Table 4 Accent 5" w:uiPriority="49"/>
+    <w:lsdException w:name="List Table 5 Dark Accent 5" w:uiPriority="50"/>
+    <w:lsdException w:name="List Table 6 Colorful Accent 5" w:uiPriority="51"/>
+    <w:lsdException w:name="List Table 7 Colorful Accent 5" w:uiPriority="52"/>
+    <w:lsdException w:name="List Table 1 Light Accent 6" w:uiPriority="46"/>
+    <w:lsdException w:name="List Table 2 Accent 6" w:uiPriority="47"/>
+    <w:lsdException w:name="List Table 3 Accent 6" w:uiPriority="48"/>
+    <w:lsdException w:name="List Table 4 Accent 6" w:uiPriority="49"/>
+    <w:lsdException w:name="List Table 5 Dark Accent 6" w:uiPriority="50"/>
+    <w:lsdException w:name="List Table 6 Colorful Accent 6" w:uiPriority="51"/>
+    <w:lsdException w:name="List Table 7 Colorful Accent 6" w:uiPriority="52"/>
+    <w:lsdException w:name="Mention" w:semiHidden="1" w:unhideWhenUsed="1"/>
+    <w:lsdException w:name="Smart Hyperlink" w:semiHidden="1" w:unhideWhenUsed="1"/>
+    <w:lsdException w:name="Hashtag" w:semiHidden="1" w:unhideWhenUsed="1"/>
+    <w:lsdException w:name="Unresolved Mention" w:semiHidden="1" w:unhideWhenUsed="1"/>
+    <w:lsdException w:name="Smart Link" w:semiHidden="1" w:unhideWhenUsed="1"/>
+  </w:latentStyles>
+  <w:style w:type="paragraph" w:default="1" w:styleId="Normal">
+    <w:name w:val="Normal"/>
+    <w:qFormat/>
+  </w:style>
+  <w:style w:type="character" w:default="1" w:styleId="DefaultParagraphFont">
+    <w:name w:val="Default Paragraph Font"/>
+    <w:uiPriority w:val="1"/>
+    <w:semiHidden/>
+    <w:unhideWhenUsed/>
+  </w:style>
+  <w:style w:type="table" w:default="1" w:styleId="TableNormal">
+    <w:name w:val="Normal Table"/>
+    <w:uiPriority w:val="99"/>
+    <w:semiHidden/>
+    <w:unhideWhenUsed/>
+    <w:tblPr>
+      <w:tblInd w:w="0" w:type="dxa"/>
+      <w:tblCellMar>
+        <w:top w:w="0" w:type="dxa"/>
+        <w:left w:w="108" w:type="dxa"/>
+        <w:bottom w:w="0" w:type="dxa"/>
+        <w:right w:w="108" w:type="dxa"/>
+      </w:tblCellMar>
+    </w:tblPr>
+  </w:style>
+  <w:style w:type="numbering" w:default="1" w:styleId="NoList">
+    <w:name w:val="No List"/>
+    <w:uiPriority w:val="99"/>
+    <w:semiHidden/>
+    <w:unhideWhenUsed/>
+  </w:style>
+  <w:style w:type="character" w:styleId="Hyperlink">
+    <w:name w:val="Hyperlink"/>
+    <w:basedOn w:val="DefaultParagraphFont"/>
+    <w:uiPriority w:val="99"/>
+    <w:unhideWhenUsed/>
+    <w:rsid w:val="00925E8A"/>
+    <w:rPr>
+      <w:color w:val="0563C1" w:themeColor="hyperlink"/>
+      <w:u w:val="single"/>
+    </w:rPr>
+  </w:style>
+  <w:style w:type="character" w:styleId="UnresolvedMention">
+    <w:name w:val="Unresolved Mention"/>
+    <w:basedOn w:val="DefaultParagraphFont"/>
+    <w:uiPriority w:val="99"/>
+    <w:semiHidden/>
+    <w:unhideWhenUsed/>
+    <w:rsid w:val="00925E8A"/>
+    <w:rPr>
+      <w:color w:val="605E5C"/>
+      <w:shd w:val="clear" w:color="auto" w:fill="E1DFDD"/>
+    </w:rPr>
+  </w:style>
 </w:styles>
+</file>
+
+<file path=word/theme/theme1.xml><?xml version="1.0" encoding="utf-8"?>
+<a:theme xmlns:a="http://schemas.openxmlformats.org/drawingml/2006/main" name="Office Theme">
+  <a:themeElements>
+    <a:clrScheme name="Office">
+      <a:dk1>
+        <a:sysClr val="windowText" lastClr="000000"/>
+      </a:dk1>
+      <a:lt1>
+        <a:sysClr val="window" lastClr="FFFFFF"/>
+      </a:lt1>
+      <a:dk2>
+        <a:srgbClr val="44546A"/>
+      </a:dk2>
+      <a:lt2>
+        <a:srgbClr val="E7E6E6"/>
+      </a:lt2>
+      <a:accent1>
+        <a:srgbClr val="4472C4"/>
+      </a:accent1>
+      <a:accent2>
+        <a:srgbClr val="ED7D31"/>
+      </a:accent2>
+      <a:accent3>
+        <a:srgbClr val="A5A5A5"/>
+      </a:accent3>
+      <a:accent4>
+        <a:srgbClr val="FFC000"/>
+      </a:accent4>
+      <a:accent5>
+        <a:srgbClr val="5B9BD5"/>
+      </a:accent5>
+      <a:accent6>
+        <a:srgbClr val="70AD47"/>
+      </a:accent6>
+      <a:hlink>
+        <a:srgbClr val="0563C1"/>
+      </a:hlink>
+      <a:folHlink>
+        <a:srgbClr val="954F72"/>
+      </a:folHlink>
+    </a:clrScheme>
+    <a:fontScheme name="Office">
+      <a:majorFont>
+        <a:latin typeface="Calibri Light" panose="020F0302020204030204"/>
+        <a:ea typeface=""/>
+        <a:cs typeface=""/>
+        <a:font script="Jpan" typeface="游ゴシック Light"/>
+        <a:font script="Hang" typeface="맑은 고딕"/>
+        <a:font script="Hans" typeface="等线 Light"/>
+        <a:font script="Hant" typeface="新細明體"/>
+        <a:font script="Arab" typeface="Times New Roman"/>
+        <a:font script="Hebr" typeface="Times New Roman"/>
+        <a:font script="Thai" typeface="Angsana New"/>
+        <a:font script="Ethi" typeface="Nyala"/>
+        <a:font script="Beng" typeface="Vrinda"/>
+        <a:font script="Gujr" typeface="Shruti"/>
+        <a:font script="Khmr" typeface="MoolBoran"/>
+        <a:font script="Knda" typeface="Tunga"/>
+        <a:font script="Guru" typeface="Raavi"/>
+        <a:font script="Cans" typeface="Euphemia"/>
+        <a:font script="Cher" typeface="Plantagenet Cherokee"/>
+        <a:font script="Yiii" typeface="Microsoft Yi Baiti"/>
+        <a:font script="Tibt" typeface="Microsoft Himalaya"/>
+        <a:font script="Thaa" typeface="MV Boli"/>
+        <a:font script="Deva" typeface="Mangal"/>
+        <a:font script="Telu" typeface="Gautami"/>
+        <a:font script="Taml" typeface="Latha"/>
+        <a:font script="Syrc" typeface="Estrangelo Edessa"/>
+        <a:font script="Orya" typeface="Kalinga"/>
+        <a:font script="Mlym" typeface="Kartika"/>
+        <a:font script="Laoo" typeface="DokChampa"/>
+        <a:font script="Sinh" typeface="Iskoola Pota"/>
+        <a:font script="Mong" typeface="Mongolian Baiti"/>
+        <a:font script="Viet" typeface="Times New Roman"/>
+        <a:font script="Uigh" typeface="Microsoft Uighur"/>
+        <a:font script="Geor" typeface="Sylfaen"/>
+        <a:font script="Armn" typeface="Arial"/>
+        <a:font script="Bugi" typeface="Leelawadee UI"/>
+        <a:font script="Bopo" typeface="Microsoft JhengHei"/>
+        <a:font script="Java" typeface="Javanese Text"/>
+        <a:font script="Lisu" typeface="Segoe UI"/>
+        <a:font script="Mymr" typeface="Myanmar Text"/>
+        <a:font script="Nkoo" typeface="Ebrima"/>
+        <a:font script="Olck" typeface="Nirmala UI"/>
+        <a:font script="Osma" typeface="Ebrima"/>
+        <a:font script="Phag" typeface="Phagspa"/>
+        <a:font script="Syrn" typeface="Estrangelo Edessa"/>
+        <a:font script="Syrj" typeface="Estrangelo Edessa"/>
+        <a:font script="Syre" typeface="Estrangelo Edessa"/>
+        <a:font script="Sora" typeface="Nirmala UI"/>
+        <a:font script="Tale" typeface="Microsoft Tai Le"/>
+        <a:font script="Talu" typeface="Microsoft New Tai Lue"/>
+        <a:font script="Tfng" typeface="Ebrima"/>
+      </a:majorFont>
+      <a:minorFont>
+        <a:latin typeface="Calibri" panose="020F0502020204030204"/>
+        <a:ea typeface=""/>
+        <a:cs typeface=""/>
+        <a:font script="Jpan" typeface="游明朝"/>
+        <a:font script="Hang" typeface="맑은 고딕"/>
+        <a:font script="Hans" typeface="等线"/>
+        <a:font script="Hant" typeface="新細明體"/>
+        <a:font script="Arab" typeface="Arial"/>
+        <a:font script="Hebr" typeface="Arial"/>
+        <a:font script="Thai" typeface="Cordia New"/>
+        <a:font script="Ethi" typeface="Nyala"/>
+        <a:font script="Beng" typeface="Vrinda"/>
+        <a:font script="Gujr" typeface="Shruti"/>
+        <a:font script="Khmr" typeface="DaunPenh"/>
+        <a:font script="Knda" typeface="Tunga"/>
+        <a:font script="Guru" typeface="Raavi"/>
+        <a:font script="Cans" typeface="Euphemia"/>
+        <a:font script="Cher" typeface="Plantagenet Cherokee"/>
+        <a:font script="Yiii" typeface="Microsoft Yi Baiti"/>
+        <a:font script="Tibt" typeface="Microsoft Himalaya"/>
+        <a:font script="Thaa" typeface="MV Boli"/>
+        <a:font script="Deva" typeface="Mangal"/>
+        <a:font script="Telu" typeface="Gautami"/>
+        <a:font script="Taml" typeface="Latha"/>
+        <a:font script="Syrc" typeface="Estrangelo Edessa"/>
+        <a:font script="Orya" typeface="Kalinga"/>
+        <a:font script="Mlym" typeface="Kartika"/>
+        <a:font script="Laoo" typeface="DokChampa"/>
+        <a:font script="Sinh" typeface="Iskoola Pota"/>
+        <a:font script="Mong" typeface="Mongolian Baiti"/>
+        <a:font script="Viet" typeface="Arial"/>
+        <a:font script="Uigh" typeface="Microsoft Uighur"/>
+        <a:font script="Geor" typeface="Sylfaen"/>
+        <a:font script="Armn" typeface="Arial"/>
+        <a:font script="Bugi" typeface="Leelawadee UI"/>
+        <a:font script="Bopo" typeface="Microsoft JhengHei"/>
+        <a:font script="Java" typeface="Javanese Text"/>
+        <a:font script="Lisu" typeface="Segoe UI"/>
+        <a:font script="Mymr" typeface="Myanmar Text"/>
+        <a:font script="Nkoo" typeface="Ebrima"/>
+        <a:font script="Olck" typeface="Nirmala UI"/>
+        <a:font script="Osma" typeface="Ebrima"/>
+        <a:font script="Phag" typeface="Phagspa"/>
+        <a:font script="Syrn" typeface="Estrangelo Edessa"/>
+        <a:font script="Syrj" typeface="Estrangelo Edessa"/>
+        <a:font script="Syre" typeface="Estrangelo Edessa"/>
+        <a:font script="Sora" typeface="Nirmala UI"/>
+        <a:font script="Tale" typeface="Microsoft Tai Le"/>
+        <a:font script="Talu" typeface="Microsoft New Tai Lue"/>
+        <a:font script="Tfng" typeface="Ebrima"/>
+      </a:minorFont>
+    </a:fontScheme>
+    <a:fmtScheme name="Office">
+      <a:fillStyleLst>
+        <a:solidFill>
+          <a:schemeClr val="phClr"/>
+        </a:solidFill>
+        <a:gradFill rotWithShape="1">
+          <a:gsLst>
+            <a:gs pos="0">
+              <a:schemeClr val="phClr">
+                <a:lumMod val="110000"/>
+                <a:satMod val="105000"/>
+                <a:tint val="67000"/>
+              </a:schemeClr>
+            </a:gs>
+            <a:gs pos="50000">
+              <a:schemeClr val="phClr">
+                <a:lumMod val="105000"/>
+                <a:satMod val="103000"/>
+                <a:tint val="73000"/>
+              </a:schemeClr>
+            </a:gs>
+            <a:gs pos="100000">
+              <a:schemeClr val="phClr">
+                <a:lumMod val="105000"/>
+                <a:satMod val="109000"/>
+                <a:tint val="81000"/>
+              </a:schemeClr>
+            </a:gs>
+          </a:gsLst>
+          <a:lin ang="5400000" scaled="0"/>
+        </a:gradFill>
+        <a:gradFill rotWithShape="1">
+          <a:gsLst>
+            <a:gs pos="0">
+              <a:schemeClr val="phClr">
+                <a:satMod val="103000"/>
+                <a:lumMod val="102000"/>
+                <a:tint val="94000"/>
+              </a:schemeClr>
+            </a:gs>
+            <a:gs pos="50000">
+              <a:schemeClr val="phClr">
+                <a:satMod val="110000"/>
+                <a:lumMod val="100000"/>
+                <a:shade val="100000"/>
+              </a:schemeClr>
+            </a:gs>
+            <a:gs pos="100000">
+              <a:schemeClr val="phClr">
+                <a:lumMod val="99000"/>
+                <a:satMod val="120000"/>
+                <a:shade val="78000"/>
+              </a:schemeClr>
+            </a:gs>
+          </a:gsLst>
+          <a:lin ang="5400000" scaled="0"/>
+        </a:gradFill>
+      </a:fillStyleLst>
+      <a:lnStyleLst>
+        <a:ln w="6350" cap="flat" cmpd="sng" algn="ctr">
+          <a:solidFill>
+            <a:schemeClr val="phClr"/>
+          </a:solidFill>
+          <a:prstDash val="solid"/>
+          <a:miter lim="800000"/>
+        </a:ln>
+        <a:ln w="12700" cap="flat" cmpd="sng" algn="ctr">
+          <a:solidFill>
+            <a:schemeClr val="phClr"/>
+          </a:solidFill>
+          <a:prstDash val="solid"/>
+          <a:miter lim="800000"/>
+        </a:ln>
+        <a:ln w="19050" cap="flat" cmpd="sng" algn="ctr">
+          <a:solidFill>
+            <a:schemeClr val="phClr"/>
+          </a:solidFill>
+          <a:prstDash val="solid"/>
+          <a:miter lim="800000"/>
+        </a:ln>
+      </a:lnStyleLst>
+      <a:effectStyleLst>
+        <a:effectStyle>
+          <a:effectLst/>
+        </a:effectStyle>
+        <a:effectStyle>
+          <a:effectLst/>
+        </a:effectStyle>
+        <a:effectStyle>
+          <a:effectLst>
+            <a:outerShdw blurRad="57150" dist="19050" dir="5400000" algn="ctr" rotWithShape="0">
+              <a:srgbClr val="000000">
+                <a:alpha val="63000"/>
+              </a:srgbClr>
+            </a:outerShdw>
+          </a:effectLst>
+        </a:effectStyle>
+      </a:effectStyleLst>
+      <a:bgFillStyleLst>
+        <a:solidFill>
+          <a:schemeClr val="phClr"/>
+        </a:solidFill>
+        <a:solidFill>
+          <a:schemeClr val="phClr">
+            <a:tint val="95000"/>
+            <a:satMod val="170000"/>
+          </a:schemeClr>
+        </a:solidFill>
+        <a:gradFill rotWithShape="1">
+          <a:gsLst>
+            <a:gs pos="0">
+              <a:schemeClr val="phClr">
+                <a:tint val="93000"/>
+                <a:satMod val="150000"/>
+                <a:shade val="98000"/>
+                <a:lumMod val="102000"/>
+              </a:schemeClr>
+            </a:gs>
+            <a:gs pos="50000">
+              <a:schemeClr val="phClr">
+                <a:tint val="98000"/>
+                <a:satMod val="130000"/>
+                <a:shade val="90000"/>
+                <a:lumMod val="103000"/>
+              </a:schemeClr>
+            </a:gs>
+            <a:gs pos="100000">
+              <a:schemeClr val="phClr">
+                <a:shade val="63000"/>
+                <a:satMod val="120000"/>
+              </a:schemeClr>
+            </a:gs>
+          </a:gsLst>
+          <a:lin ang="5400000" scaled="0"/>
+        </a:gradFill>
+      </a:bgFillStyleLst>
+    </a:fmtScheme>
+  </a:themeElements>
+  <a:objectDefaults/>
+  <a:extraClrSchemeLst/>
+  <a:extLst>
+    <a:ext uri="{05A4C25C-085E-4340-85A3-A5531E510DB2}">
+      <thm15:themeFamily xmlns:thm15="http://schemas.microsoft.com/office/thememl/2012/main" name="Office Theme" id="{62F939B6-93AF-4DB8-9C6B-D6C7DFDC589F}" vid="{4A3C46E8-61CC-4603-A589-7422A47A8E4A}"/>
+    </a:ext>
+  </a:extLst>
+</a:theme>
 </file>
</xml_diff>